<commit_message>
memoria: mi columna del reparto del trabajo (apartado 12) y mi declaración de uso de IA (anexo A.3)
</commit_message>
<xml_diff>
--- a/docs/tarea2/Memoria_Tarea2_Entrelibros.docx
+++ b/docs/tarea2/Memoria_Tarea2_Entrelibros.docx
@@ -9680,9 +9680,23 @@
               <w:rPr>
                 <w:sz w:val="18"/>
                 <w:szCs w:val="18"/>
-                <w:highlight w:val="yellow"/>
-              </w:rPr>
-              <w:t xml:space="preserve">Nino: completar</w:t>
+              </w:rPr>
+              <w:t xml:space="preserve">Revisión del primer diseño tras la aclaración del profesor y propuesta de sacar el ERP a un proyecto propio; límite detectado: la protección contra eventos fuera de orden (</w:t>
+            </w:r>
+            <w:r>
+              <w:rPr>
+                <w:rFonts w:ascii="Courier New" w:hAnsi="Courier New" w:cs="Courier New"/>
+                <w:sz w:val="18"/>
+                <w:szCs w:val="18"/>
+              </w:rPr>
+              <w:t xml:space="preserve">last_event_at</w:t>
+            </w:r>
+            <w:r>
+              <w:rPr>
+                <w:sz w:val="18"/>
+                <w:szCs w:val="18"/>
+              </w:rPr>
+              <w:t xml:space="preserve">) solo cubre los pedidos</w:t>
             </w:r>
           </w:p>
         </w:tc>
@@ -9771,15 +9785,22 @@
                 <w:sz w:val="18"/>
                 <w:szCs w:val="18"/>
               </w:rPr>
-              <w:t xml:space="preserve">Página de soporte con enlace a Telegram </w:t>
-            </w:r>
-            <w:r>
-              <w:rPr>
-                <w:sz w:val="18"/>
-                <w:szCs w:val="18"/>
-                <w:highlight w:val="yellow"/>
-              </w:rPr>
-              <w:t xml:space="preserve">confirmar</w:t>
+              <w:t xml:space="preserve">Traducción al inglés de la página Integración (</w:t>
+            </w:r>
+            <w:r>
+              <w:rPr>
+                <w:rFonts w:ascii="Courier New" w:hAnsi="Courier New" w:cs="Courier New"/>
+                <w:sz w:val="18"/>
+                <w:szCs w:val="18"/>
+              </w:rPr>
+              <w:t xml:space="preserve">en-admin.js</w:t>
+            </w:r>
+            <w:r>
+              <w:rPr>
+                <w:sz w:val="18"/>
+                <w:szCs w:val="18"/>
+              </w:rPr>
+              <w:t xml:space="preserve">), rehecha al separar el ERP</w:t>
             </w:r>
           </w:p>
         </w:tc>
@@ -9837,9 +9858,23 @@
               <w:rPr>
                 <w:sz w:val="18"/>
                 <w:szCs w:val="18"/>
-                <w:highlight w:val="yellow"/>
-              </w:rPr>
-              <w:t xml:space="preserve">Nino: completar</w:t>
+              </w:rPr>
+              <w:t xml:space="preserve">Pruebas del contrato contra la validación de n8n: evento válido, sin email, importes que no cuadran, formato, duplicado y fuera de orden, con los payloads de error 5 y 6 (</w:t>
+            </w:r>
+            <w:r>
+              <w:rPr>
+                <w:rFonts w:ascii="Courier New" w:hAnsi="Courier New" w:cs="Courier New"/>
+                <w:sz w:val="18"/>
+                <w:szCs w:val="18"/>
+              </w:rPr>
+              <w:t xml:space="preserve">pruebas.md</w:t>
+            </w:r>
+            <w:r>
+              <w:rPr>
+                <w:sz w:val="18"/>
+                <w:szCs w:val="18"/>
+              </w:rPr>
+              <w:t xml:space="preserve">)</w:t>
             </w:r>
           </w:p>
         </w:tc>
@@ -9897,9 +9932,8 @@
               <w:rPr>
                 <w:sz w:val="18"/>
                 <w:szCs w:val="18"/>
-                <w:highlight w:val="yellow"/>
-              </w:rPr>
-              <w:t xml:space="preserve">Nino: completar</w:t>
+              </w:rPr>
+              <w:t xml:space="preserve">Explicación del agente en la defensa: sus cuatro herramientas, la nota interna reversible, lo que no puede hacer, la salida JSON y su validación, y qué pasa si Gemini falla</w:t>
             </w:r>
           </w:p>
         </w:tc>
@@ -9957,9 +9991,23 @@
               <w:rPr>
                 <w:sz w:val="18"/>
                 <w:szCs w:val="18"/>
-                <w:highlight w:val="yellow"/>
-              </w:rPr>
-              <w:t xml:space="preserve">Nino: memoria, presentación, anexo de IA</w:t>
+              </w:rPr>
+              <w:t xml:space="preserve">Pruebas del contrato (</w:t>
+            </w:r>
+            <w:r>
+              <w:rPr>
+                <w:rFonts w:ascii="Courier New" w:hAnsi="Courier New" w:cs="Courier New"/>
+                <w:sz w:val="18"/>
+                <w:szCs w:val="18"/>
+              </w:rPr>
+              <w:t xml:space="preserve">pruebas.md</w:t>
+            </w:r>
+            <w:r>
+              <w:rPr>
+                <w:sz w:val="18"/>
+                <w:szCs w:val="18"/>
+              </w:rPr>
+              <w:t xml:space="preserve">), apartado 12 y anexo A.3 de esta memoria y repaso de las diapositivas del agente, las métricas y la decisión</w:t>
             </w:r>
           </w:p>
         </w:tc>
@@ -11211,10 +11259,633 @@
       </w:pPr>
       <w:r>
         <w:rPr>
+          <w:b w:val="1"/>
+          <w:bCs w:val="1"/>
+        </w:rPr>
+        <w:t xml:space="preserve">Herramienta:</w:t>
+      </w:r>
+      <w:r>
+        <w:rPr/>
+        <w:t xml:space="preserve"> Claude Code (Anthropic, modelo Claude Opus 5.5) en Visual Studio Code, con acceso a mi copia local del repositorio. No he usado ninguna otra herramienta de IA. La IA no tuvo acceso a n8n, a Supabase ni a Render, ni a ninguna clave.</w:t>
+      </w:r>
+    </w:p>
+    <w:p>
+      <w:pPr>
+        <w:numPr>
+          <w:ilvl w:val="0"/>
+          <w:numId w:val="1"/>
+        </w:numPr>
+        <w:spacing w:before="0" w:after="60"/>
+        <w:jc w:val="both"/>
+      </w:pPr>
+      <w:r>
+        <w:rPr>
+          <w:b w:val="1"/>
+          <w:bCs w:val="1"/>
+        </w:rPr>
+        <w:t xml:space="preserve">Para qué la he usado:</w:t>
+      </w:r>
+      <w:r>
+        <w:rPr/>
+        <w:t xml:space="preserve"> entender el reparto de tareas y la aclaración del profesor sobre el back-office, y revisar con ella el primer diseño del ERP (</w:t>
+      </w:r>
+      <w:r>
+        <w:rPr>
+          <w:rFonts w:ascii="Courier New" w:hAnsi="Courier New" w:cs="Courier New"/>
+          <w:sz w:val="20"/>
+          <w:szCs w:val="20"/>
+        </w:rPr>
+        <w:t xml:space="preserve">14_integracion.sql</w:t>
+      </w:r>
+      <w:r>
+        <w:rPr/>
+        <w:t xml:space="preserve">); traducir al inglés la página Integración de la tienda (</w:t>
+      </w:r>
+      <w:r>
+        <w:rPr>
+          <w:rFonts w:ascii="Courier New" w:hAnsi="Courier New" w:cs="Courier New"/>
+          <w:sz w:val="20"/>
+          <w:szCs w:val="20"/>
+        </w:rPr>
+        <w:t xml:space="preserve">en-admin.js</w:t>
+      </w:r>
+      <w:r>
+        <w:rPr/>
+        <w:t xml:space="preserve">) y actualizar la traducción cuando la página se rehízo; escribir las pruebas del contrato (</w:t>
+      </w:r>
+      <w:r>
+        <w:rPr>
+          <w:rFonts w:ascii="Courier New" w:hAnsi="Courier New" w:cs="Courier New"/>
+          <w:sz w:val="20"/>
+          <w:szCs w:val="20"/>
+        </w:rPr>
+        <w:t xml:space="preserve">pruebas.md</w:t>
+      </w:r>
+      <w:r>
+        <w:rPr/>
+        <w:t xml:space="preserve">) y los payloads de error 5 (número de pedido mal formado) y 6 (evento fuera de orden), y preparar el borrador de mi parte de esta memoria.</w:t>
+      </w:r>
+    </w:p>
+    <w:p>
+      <w:pPr>
+        <w:numPr>
+          <w:ilvl w:val="0"/>
+          <w:numId w:val="1"/>
+        </w:numPr>
+        <w:spacing w:before="0" w:after="60"/>
+        <w:jc w:val="both"/>
+      </w:pPr>
+      <w:r>
+        <w:rPr>
+          <w:b w:val="1"/>
+          <w:bCs w:val="1"/>
+        </w:rPr>
+        <w:t xml:space="preserve">Qué he decidido y hecho yo:</w:t>
+      </w:r>
+      <w:r>
+        <w:rPr/>
+        <w:t xml:space="preserve"> plantear a Pablo que el ERP pasara a un proyecto propio de Supabase; el orden de trabajo (primero lo que no dependía de la arquitectura); las traducciones dudosas (por ejemplo, «Último día» como «Last 24 hours», porque la consulta mira las últimas 24 horas); trabajar en una rama propia con un commit por tarea, revisando cada cambio antes de subirlo, y declarar aquí el uso de la IA en lugar de firmar los commits con ella.</w:t>
+      </w:r>
+    </w:p>
+    <w:p>
+      <w:pPr>
+        <w:numPr>
+          <w:ilvl w:val="0"/>
+          <w:numId w:val="1"/>
+        </w:numPr>
+        <w:spacing w:before="0" w:after="60"/>
+        <w:jc w:val="both"/>
+      </w:pPr>
+      <w:r>
+        <w:rPr>
+          <w:b w:val="1"/>
+          <w:bCs w:val="1"/>
+        </w:rPr>
+        <w:t xml:space="preserve">Cómo lo he comprobado:</w:t>
+      </w:r>
+      <w:r>
+        <w:rPr/>
+        <w:t xml:space="preserve"> ejecutando con Node el código del nodo «Validar y normalizar» de n8n sobre cada payload (los mensajes de </w:t>
+      </w:r>
+      <w:r>
+        <w:rPr>
+          <w:rFonts w:ascii="Courier New" w:hAnsi="Courier New" w:cs="Courier New"/>
+          <w:sz w:val="20"/>
+          <w:szCs w:val="20"/>
+        </w:rPr>
+        <w:t xml:space="preserve">pruebas.md</w:t>
+      </w:r>
+      <w:r>
+        <w:rPr/>
+        <w:t xml:space="preserve"> son su salida literal), y repitiéndolo después de separar el ERP; leyendo </w:t>
+      </w:r>
+      <w:r>
+        <w:rPr>
+          <w:rFonts w:ascii="Courier New" w:hAnsi="Courier New" w:cs="Courier New"/>
+          <w:sz w:val="20"/>
+          <w:szCs w:val="20"/>
+        </w:rPr>
+        <w:t xml:space="preserve">erp_upsert_order</w:t>
+      </w:r>
+      <w:r>
+        <w:rPr/>
+        <w:t xml:space="preserve"> para los casos de duplicado y fuera de orden; y con un script que reproduce el traductor de la web (</w:t>
+      </w:r>
+      <w:r>
+        <w:rPr>
+          <w:rFonts w:ascii="Courier New" w:hAnsi="Courier New" w:cs="Courier New"/>
+          <w:sz w:val="20"/>
+          <w:szCs w:val="20"/>
+        </w:rPr>
+        <w:t xml:space="preserve">i18n.js</w:t>
+      </w:r>
+      <w:r>
+        <w:rPr/>
+        <w:t xml:space="preserve">) sobre todos los textos de la página: ninguno queda sin traducir, no hay claves duplicadas y no cambia ninguna traducción que ya existía. </w:t>
+      </w:r>
+      <w:r>
+        <w:rPr>
           <w:highlight w:val="yellow"/>
         </w:rPr>
-        <w:t xml:space="preserve">Nino: completa aquí tu declaración con el mismo esquema: herramienta(s), para qué, qué decidiste tú, cómo lo comprobaste y errores encontrados.</w:t>
-      </w:r>
+        <w:t xml:space="preserve">Pendiente: probar la página en inglés con el usuario administrador y repetir los casos 5 y 6 en el n8n desplegado.</w:t>
+      </w:r>
+    </w:p>
+    <w:p>
+      <w:pPr>
+        <w:spacing w:before="0" w:after="120"/>
+        <w:jc w:val="both"/>
+      </w:pPr>
+      <w:r>
+        <w:rPr>
+          <w:b w:val="1"/>
+          <w:bCs w:val="1"/>
+        </w:rPr>
+        <w:t xml:space="preserve">Errores encontrados y cambios realizados:</w:t>
+      </w:r>
+    </w:p>
+    <w:tbl>
+      <w:tblPr>
+        <w:tblW w:w="8788" w:type="dxa"/>
+        <w:tblBorders>
+          <w:top w:val="single" w:sz="4" w:space="0" w:color="B7C4D3"/>
+          <w:left w:val="single" w:sz="4" w:space="0" w:color="B7C4D3"/>
+          <w:bottom w:val="single" w:sz="4" w:space="0" w:color="B7C4D3"/>
+          <w:right w:val="single" w:sz="4" w:space="0" w:color="B7C4D3"/>
+          <w:insideH w:val="single" w:sz="4" w:space="0" w:color="B7C4D3"/>
+          <w:insideV w:val="single" w:sz="4" w:space="0" w:color="B7C4D3"/>
+        </w:tblBorders>
+        <w:tblLayout w:type="fixed"/>
+        <w:tblCellMar>
+          <w:top w:w="40" w:type="dxa"/>
+          <w:left w:w="90" w:type="dxa"/>
+          <w:bottom w:w="40" w:type="dxa"/>
+          <w:right w:w="90" w:type="dxa"/>
+        </w:tblCellMar>
+      </w:tblPr>
+      <w:tblGrid>
+        <w:gridCol w:w="2636"/>
+        <w:gridCol w:w="3076"/>
+        <w:gridCol w:w="3076"/>
+      </w:tblGrid>
+      <w:tr>
+        <w:trPr>
+          <w:tblHeader/>
+          <w:cantSplit/>
+        </w:trPr>
+        <w:tc>
+          <w:tcPr>
+            <w:tcW w:w="2636" w:type="dxa"/>
+            <w:shd w:val="clear" w:color="auto" w:fill="004379"/>
+          </w:tcPr>
+          <w:p>
+            <w:pPr>
+              <w:spacing w:before="0" w:after="0" w:line="240" w:lineRule="auto"/>
+            </w:pPr>
+            <w:r>
+              <w:rPr>
+                <w:b w:val="1"/>
+                <w:bCs w:val="1"/>
+                <w:color w:val="FFFFFF"/>
+                <w:sz w:val="18"/>
+                <w:szCs w:val="18"/>
+              </w:rPr>
+              <w:t xml:space="preserve">Problema</w:t>
+            </w:r>
+          </w:p>
+        </w:tc>
+        <w:tc>
+          <w:tcPr>
+            <w:tcW w:w="3076" w:type="dxa"/>
+            <w:shd w:val="clear" w:color="auto" w:fill="004379"/>
+          </w:tcPr>
+          <w:p>
+            <w:pPr>
+              <w:spacing w:before="0" w:after="0" w:line="240" w:lineRule="auto"/>
+            </w:pPr>
+            <w:r>
+              <w:rPr>
+                <w:b w:val="1"/>
+                <w:bCs w:val="1"/>
+                <w:color w:val="FFFFFF"/>
+                <w:sz w:val="18"/>
+                <w:szCs w:val="18"/>
+              </w:rPr>
+              <w:t xml:space="preserve">Causa</w:t>
+            </w:r>
+          </w:p>
+        </w:tc>
+        <w:tc>
+          <w:tcPr>
+            <w:tcW w:w="3076" w:type="dxa"/>
+            <w:shd w:val="clear" w:color="auto" w:fill="004379"/>
+          </w:tcPr>
+          <w:p>
+            <w:pPr>
+              <w:spacing w:before="0" w:after="0" w:line="240" w:lineRule="auto"/>
+            </w:pPr>
+            <w:r>
+              <w:rPr>
+                <w:b w:val="1"/>
+                <w:bCs w:val="1"/>
+                <w:color w:val="FFFFFF"/>
+                <w:sz w:val="18"/>
+                <w:szCs w:val="18"/>
+              </w:rPr>
+              <w:t xml:space="preserve">Cambio</w:t>
+            </w:r>
+          </w:p>
+        </w:tc>
+      </w:tr>
+      <w:tr>
+        <w:trPr>
+          <w:cantSplit/>
+        </w:trPr>
+        <w:tc>
+          <w:tcPr>
+            <w:tcW w:w="2636" w:type="dxa"/>
+            <w:shd w:val="clear" w:color="auto" w:fill="FFFFFF"/>
+          </w:tcPr>
+          <w:p>
+            <w:pPr>
+              <w:spacing w:before="0" w:after="0" w:line="240" w:lineRule="auto"/>
+            </w:pPr>
+            <w:r>
+              <w:rPr>
+                <w:sz w:val="18"/>
+                <w:szCs w:val="18"/>
+              </w:rPr>
+              <w:t xml:space="preserve">Una traducción duplicada («Caducado»)</w:t>
+            </w:r>
+          </w:p>
+        </w:tc>
+        <w:tc>
+          <w:tcPr>
+            <w:tcW w:w="3076" w:type="dxa"/>
+            <w:shd w:val="clear" w:color="auto" w:fill="FFFFFF"/>
+          </w:tcPr>
+          <w:p>
+            <w:pPr>
+              <w:spacing w:before="0" w:after="0" w:line="240" w:lineRule="auto"/>
+            </w:pPr>
+            <w:r>
+              <w:rPr>
+                <w:sz w:val="18"/>
+                <w:szCs w:val="18"/>
+              </w:rPr>
+              <w:t xml:space="preserve">La IA la añadió aunque ya existía; en un objeto de JavaScript la segunda clave pisa a la primera sin avisar</w:t>
+            </w:r>
+          </w:p>
+        </w:tc>
+        <w:tc>
+          <w:tcPr>
+            <w:tcW w:w="3076" w:type="dxa"/>
+            <w:shd w:val="clear" w:color="auto" w:fill="FFFFFF"/>
+          </w:tcPr>
+          <w:p>
+            <w:pPr>
+              <w:spacing w:before="0" w:after="0" w:line="240" w:lineRule="auto"/>
+            </w:pPr>
+            <w:r>
+              <w:rPr>
+                <w:sz w:val="18"/>
+                <w:szCs w:val="18"/>
+              </w:rPr>
+              <w:t xml:space="preserve">La detectó el script de comprobación y se quitó</w:t>
+            </w:r>
+          </w:p>
+        </w:tc>
+      </w:tr>
+      <w:tr>
+        <w:trPr>
+          <w:cantSplit/>
+        </w:trPr>
+        <w:tc>
+          <w:tcPr>
+            <w:tcW w:w="2636" w:type="dxa"/>
+            <w:shd w:val="clear" w:color="auto" w:fill="F2F5F9"/>
+          </w:tcPr>
+          <w:p>
+            <w:pPr>
+              <w:spacing w:before="0" w:after="0" w:line="240" w:lineRule="auto"/>
+            </w:pPr>
+            <w:r>
+              <w:rPr>
+                <w:sz w:val="18"/>
+                <w:szCs w:val="18"/>
+              </w:rPr>
+              <w:t xml:space="preserve">Descripción errónea del botón «Reintentar» en las pruebas</w:t>
+            </w:r>
+          </w:p>
+        </w:tc>
+        <w:tc>
+          <w:tcPr>
+            <w:tcW w:w="3076" w:type="dxa"/>
+            <w:shd w:val="clear" w:color="auto" w:fill="F2F5F9"/>
+          </w:tcPr>
+          <w:p>
+            <w:pPr>
+              <w:spacing w:before="0" w:after="0" w:line="240" w:lineRule="auto"/>
+            </w:pPr>
+            <w:r>
+              <w:rPr>
+                <w:sz w:val="18"/>
+                <w:szCs w:val="18"/>
+              </w:rPr>
+              <w:t xml:space="preserve">El primer borrador decía que reenvía el evento después de corregir el dato en la tienda</w:t>
+            </w:r>
+          </w:p>
+        </w:tc>
+        <w:tc>
+          <w:tcPr>
+            <w:tcW w:w="3076" w:type="dxa"/>
+            <w:shd w:val="clear" w:color="auto" w:fill="F2F5F9"/>
+          </w:tcPr>
+          <w:p>
+            <w:pPr>
+              <w:spacing w:before="0" w:after="0" w:line="240" w:lineRule="auto"/>
+            </w:pPr>
+            <w:r>
+              <w:rPr>
+                <w:rFonts w:ascii="Courier New" w:hAnsi="Courier New" w:cs="Courier New"/>
+                <w:sz w:val="18"/>
+                <w:szCs w:val="18"/>
+              </w:rPr>
+              <w:t xml:space="preserve">admin_integration_retry</w:t>
+            </w:r>
+            <w:r>
+              <w:rPr>
+                <w:sz w:val="18"/>
+                <w:szCs w:val="18"/>
+              </w:rPr>
+              <w:t xml:space="preserve"> reenvía el mismo payload guardado en la cola; se corrigió el texto</w:t>
+            </w:r>
+          </w:p>
+        </w:tc>
+      </w:tr>
+      <w:tr>
+        <w:trPr>
+          <w:cantSplit/>
+        </w:trPr>
+        <w:tc>
+          <w:tcPr>
+            <w:tcW w:w="2636" w:type="dxa"/>
+            <w:shd w:val="clear" w:color="auto" w:fill="FFFFFF"/>
+          </w:tcPr>
+          <w:p>
+            <w:pPr>
+              <w:spacing w:before="0" w:after="0" w:line="240" w:lineRule="auto"/>
+            </w:pPr>
+            <w:r>
+              <w:rPr>
+                <w:sz w:val="18"/>
+                <w:szCs w:val="18"/>
+              </w:rPr>
+              <w:t xml:space="preserve">Los duplicados en el cuadro de mando</w:t>
+            </w:r>
+          </w:p>
+        </w:tc>
+        <w:tc>
+          <w:tcPr>
+            <w:tcW w:w="3076" w:type="dxa"/>
+            <w:shd w:val="clear" w:color="auto" w:fill="FFFFFF"/>
+          </w:tcPr>
+          <w:p>
+            <w:pPr>
+              <w:spacing w:before="0" w:after="0" w:line="240" w:lineRule="auto"/>
+            </w:pPr>
+            <w:r>
+              <w:rPr>
+                <w:sz w:val="18"/>
+                <w:szCs w:val="18"/>
+              </w:rPr>
+              <w:t xml:space="preserve">El borrador decía que se contaban aparte de los eventos correctos</w:t>
+            </w:r>
+          </w:p>
+        </w:tc>
+        <w:tc>
+          <w:tcPr>
+            <w:tcW w:w="3076" w:type="dxa"/>
+            <w:shd w:val="clear" w:color="auto" w:fill="FFFFFF"/>
+          </w:tcPr>
+          <w:p>
+            <w:pPr>
+              <w:spacing w:before="0" w:after="0" w:line="240" w:lineRule="auto"/>
+            </w:pPr>
+            <w:r>
+              <w:rPr>
+                <w:sz w:val="18"/>
+                <w:szCs w:val="18"/>
+              </w:rPr>
+              <w:t xml:space="preserve">La consulta los cuenta como aplicados y además los muestra aparte; se corrigió el texto</w:t>
+            </w:r>
+          </w:p>
+        </w:tc>
+      </w:tr>
+      <w:tr>
+        <w:trPr>
+          <w:cantSplit/>
+        </w:trPr>
+        <w:tc>
+          <w:tcPr>
+            <w:tcW w:w="2636" w:type="dxa"/>
+            <w:shd w:val="clear" w:color="auto" w:fill="F2F5F9"/>
+          </w:tcPr>
+          <w:p>
+            <w:pPr>
+              <w:spacing w:before="0" w:after="0" w:line="240" w:lineRule="auto"/>
+            </w:pPr>
+            <w:r>
+              <w:rPr>
+                <w:sz w:val="18"/>
+                <w:szCs w:val="18"/>
+              </w:rPr>
+              <w:t xml:space="preserve">Traducción y pruebas desfasadas</w:t>
+            </w:r>
+          </w:p>
+        </w:tc>
+        <w:tc>
+          <w:tcPr>
+            <w:tcW w:w="3076" w:type="dxa"/>
+            <w:shd w:val="clear" w:color="auto" w:fill="F2F5F9"/>
+          </w:tcPr>
+          <w:p>
+            <w:pPr>
+              <w:spacing w:before="0" w:after="0" w:line="240" w:lineRule="auto"/>
+            </w:pPr>
+            <w:r>
+              <w:rPr>
+                <w:sz w:val="18"/>
+                <w:szCs w:val="18"/>
+              </w:rPr>
+              <w:t xml:space="preserve">Al separar el ERP, la página Integración se rehízo y las funciones del ERP pasaron a </w:t>
+            </w:r>
+            <w:r>
+              <w:rPr>
+                <w:rFonts w:ascii="Courier New" w:hAnsi="Courier New" w:cs="Courier New"/>
+                <w:sz w:val="18"/>
+                <w:szCs w:val="18"/>
+              </w:rPr>
+              <w:t xml:space="preserve">erp/</w:t>
+            </w:r>
+          </w:p>
+        </w:tc>
+        <w:tc>
+          <w:tcPr>
+            <w:tcW w:w="3076" w:type="dxa"/>
+            <w:shd w:val="clear" w:color="auto" w:fill="F2F5F9"/>
+          </w:tcPr>
+          <w:p>
+            <w:pPr>
+              <w:spacing w:before="0" w:after="0" w:line="240" w:lineRule="auto"/>
+            </w:pPr>
+            <w:r>
+              <w:rPr>
+                <w:sz w:val="18"/>
+                <w:szCs w:val="18"/>
+              </w:rPr>
+              <w:t xml:space="preserve">Se actualizaron las dos; antes de quitar las traducciones sin uso se comprobó que ninguna otra página las usaba</w:t>
+            </w:r>
+          </w:p>
+        </w:tc>
+      </w:tr>
+      <w:tr>
+        <w:trPr>
+          <w:cantSplit/>
+        </w:trPr>
+        <w:tc>
+          <w:tcPr>
+            <w:tcW w:w="2636" w:type="dxa"/>
+            <w:shd w:val="clear" w:color="auto" w:fill="FFFFFF"/>
+          </w:tcPr>
+          <w:p>
+            <w:pPr>
+              <w:spacing w:before="0" w:after="0" w:line="240" w:lineRule="auto"/>
+            </w:pPr>
+            <w:r>
+              <w:rPr>
+                <w:sz w:val="18"/>
+                <w:szCs w:val="18"/>
+              </w:rPr>
+              <w:t xml:space="preserve">Un evento antiguo de stock o de una incidencia sobrescribiría un dato más reciente</w:t>
+            </w:r>
+          </w:p>
+        </w:tc>
+        <w:tc>
+          <w:tcPr>
+            <w:tcW w:w="3076" w:type="dxa"/>
+            <w:shd w:val="clear" w:color="auto" w:fill="FFFFFF"/>
+          </w:tcPr>
+          <w:p>
+            <w:pPr>
+              <w:spacing w:before="0" w:after="0" w:line="240" w:lineRule="auto"/>
+            </w:pPr>
+            <w:r>
+              <w:rPr>
+                <w:rFonts w:ascii="Courier New" w:hAnsi="Courier New" w:cs="Courier New"/>
+                <w:sz w:val="18"/>
+                <w:szCs w:val="18"/>
+              </w:rPr>
+              <w:t xml:space="preserve">last_event_at</w:t>
+            </w:r>
+            <w:r>
+              <w:rPr>
+                <w:sz w:val="18"/>
+                <w:szCs w:val="18"/>
+              </w:rPr>
+              <w:t xml:space="preserve"> solo se comprueba en los pedidos (</w:t>
+            </w:r>
+            <w:r>
+              <w:rPr>
+                <w:rFonts w:ascii="Courier New" w:hAnsi="Courier New" w:cs="Courier New"/>
+                <w:sz w:val="18"/>
+                <w:szCs w:val="18"/>
+              </w:rPr>
+              <w:t xml:space="preserve">erp_upsert_order</w:t>
+            </w:r>
+            <w:r>
+              <w:rPr>
+                <w:sz w:val="18"/>
+                <w:szCs w:val="18"/>
+              </w:rPr>
+              <w:t xml:space="preserve">)</w:t>
+            </w:r>
+          </w:p>
+        </w:tc>
+        <w:tc>
+          <w:tcPr>
+            <w:tcW w:w="3076" w:type="dxa"/>
+            <w:shd w:val="clear" w:color="auto" w:fill="FFFFFF"/>
+          </w:tcPr>
+          <w:p>
+            <w:pPr>
+              <w:spacing w:before="0" w:after="0" w:line="240" w:lineRule="auto"/>
+            </w:pPr>
+            <w:r>
+              <w:rPr>
+                <w:sz w:val="18"/>
+                <w:szCs w:val="18"/>
+              </w:rPr>
+              <w:t xml:space="preserve">Propuesta: la misma comparación en las tablas </w:t>
+            </w:r>
+            <w:r>
+              <w:rPr>
+                <w:rFonts w:ascii="Courier New" w:hAnsi="Courier New" w:cs="Courier New"/>
+                <w:sz w:val="18"/>
+                <w:szCs w:val="18"/>
+              </w:rPr>
+              <w:t xml:space="preserve">inventory</w:t>
+            </w:r>
+            <w:r>
+              <w:rPr>
+                <w:sz w:val="18"/>
+                <w:szCs w:val="18"/>
+              </w:rPr>
+              <w:t xml:space="preserve"> y </w:t>
+            </w:r>
+            <w:r>
+              <w:rPr>
+                <w:rFonts w:ascii="Courier New" w:hAnsi="Courier New" w:cs="Courier New"/>
+                <w:sz w:val="18"/>
+                <w:szCs w:val="18"/>
+              </w:rPr>
+              <w:t xml:space="preserve">tickets</w:t>
+            </w:r>
+            <w:r>
+              <w:rPr>
+                <w:sz w:val="18"/>
+                <w:szCs w:val="18"/>
+              </w:rPr>
+              <w:t xml:space="preserve"> del ERP</w:t>
+            </w:r>
+          </w:p>
+        </w:tc>
+      </w:tr>
+    </w:tbl>
+    <w:p>
+      <w:pPr>
+        <w:spacing w:before="0" w:after="60"/>
+        <w:jc w:val="both"/>
+      </w:pPr>
     </w:p>
     <w:sectPr>
       <w:headerReference r:id="rId12" w:type="default"/>

</xml_diff>

<commit_message>
Memoria con la parte de Nino (PR #8) y limpieza del repositorio
- Memoria regenerada desde el script con el apartado 12 y el anexo A.3 de Nino.
- Corregido el apartado 3: last_event_at solo protege los pedidos; añadido el riesgo en el apartado 11.
- Los términos en cursiva ya no salen con asteriscos literales.
- A.2: el 422 se comprobó en el entorno local.
- Fuera la copia public/js/i18n/en-admin 2.js y la caché supabase/.temp/ (ahora en .gitignore).

Co-Authored-By: Claude Opus 5.5 <noreply@anthropic.com>
Claude-Session: https://claude.ai/code/session_018RfQFTr8FjC9r6pjyYQgv4
</commit_message>
<xml_diff>
--- a/docs/tarea2/Memoria_Tarea2_Entrelibros.docx
+++ b/docs/tarea2/Memoria_Tarea2_Entrelibros.docx
@@ -1161,7 +1161,7 @@
                 <w:bCs w:val="1"/>
                 <w:color w:val="383838"/>
               </w:rPr>
-              <w:t xml:space="preserve">7</w:t>
+              <w:t xml:space="preserve">8</w:t>
             </w:r>
             <w:r>
               <w:rPr>
@@ -1295,7 +1295,7 @@
                 <w:bCs w:val="1"/>
                 <w:color w:val="383838"/>
               </w:rPr>
-              <w:t xml:space="preserve">10</w:t>
+              <w:t xml:space="preserve">11</w:t>
             </w:r>
             <w:r>
               <w:rPr>
@@ -1362,7 +1362,7 @@
                 <w:bCs w:val="1"/>
                 <w:color w:val="383838"/>
               </w:rPr>
-              <w:t xml:space="preserve">11</w:t>
+              <w:t xml:space="preserve">12</w:t>
             </w:r>
             <w:r>
               <w:rPr>
@@ -1429,7 +1429,7 @@
                 <w:bCs w:val="1"/>
                 <w:color w:val="383838"/>
               </w:rPr>
-              <w:t xml:space="preserve">12</w:t>
+              <w:t xml:space="preserve">13</w:t>
             </w:r>
             <w:r>
               <w:rPr>
@@ -1484,7 +1484,7 @@
               <w:rPr>
                 <w:color w:val="383838"/>
               </w:rPr>
-              <w:t xml:space="preserve">12</w:t>
+              <w:t xml:space="preserve">13</w:t>
             </w:r>
             <w:r>
               <w:rPr>
@@ -1537,7 +1537,7 @@
               <w:rPr>
                 <w:color w:val="383838"/>
               </w:rPr>
-              <w:t xml:space="preserve">12</w:t>
+              <w:t xml:space="preserve">13</w:t>
             </w:r>
             <w:r>
               <w:rPr>
@@ -1590,7 +1590,7 @@
               <w:rPr>
                 <w:color w:val="383838"/>
               </w:rPr>
-              <w:t xml:space="preserve">13</w:t>
+              <w:t xml:space="preserve">14</w:t>
             </w:r>
             <w:r>
               <w:rPr>
@@ -2749,7 +2749,18 @@
       </w:r>
       <w:r>
         <w:rPr/>
-        <w:t xml:space="preserve">: la tienda nunca llama a n8n desde el navegador ni depende de que n8n esté despierto, y nunca escribe en el back-office: solo publica eventos. Cuando el servidor registra un evento integrable, un *trigger* lo copia a la cola </w:t>
+        <w:t xml:space="preserve">: la tienda nunca llama a n8n desde el navegador ni depende de que n8n esté despierto, y nunca escribe en el back-office: solo publica eventos. Cuando el servidor registra un evento integrable, un </w:t>
+      </w:r>
+      <w:r>
+        <w:rPr>
+          <w:i w:val="1"/>
+          <w:iCs w:val="1"/>
+        </w:rPr>
+        <w:t xml:space="preserve">trigger</w:t>
+      </w:r>
+      <w:r>
+        <w:rPr/>
+        <w:t xml:space="preserve"> lo copia a la cola </w:t>
       </w:r>
       <w:r>
         <w:rPr>
@@ -3759,7 +3770,7 @@
                 <w:sz w:val="18"/>
                 <w:szCs w:val="18"/>
               </w:rPr>
-              <w:t xml:space="preserve">) y </w:t>
+              <w:t xml:space="preserve">) y, en los pedidos, </w:t>
             </w:r>
             <w:r>
               <w:rPr>
@@ -3774,7 +3785,7 @@
                 <w:sz w:val="18"/>
                 <w:szCs w:val="18"/>
               </w:rPr>
-              <w:t xml:space="preserve"> (un evento más antiguo se marca </w:t>
+              <w:t xml:space="preserve"> (un evento más antiguo que el último aplicado se marca </w:t>
             </w:r>
             <w:r>
               <w:rPr>
@@ -3789,7 +3800,7 @@
                 <w:sz w:val="18"/>
                 <w:szCs w:val="18"/>
               </w:rPr>
-              <w:t xml:space="preserve">)</w:t>
+              <w:t xml:space="preserve">); el stock y las incidencias solo detectan duplicados (ver apartado 11)</w:t>
             </w:r>
           </w:p>
         </w:tc>
@@ -4871,7 +4882,23 @@
                 <w:sz w:val="18"/>
                 <w:szCs w:val="18"/>
               </w:rPr>
-              <w:t xml:space="preserve"> reintenta con espera creciente; un *keepalive* despierta a n8n</w:t>
+              <w:t xml:space="preserve"> reintenta con espera creciente; un </w:t>
+            </w:r>
+            <w:r>
+              <w:rPr>
+                <w:i w:val="1"/>
+                <w:iCs w:val="1"/>
+                <w:sz w:val="18"/>
+                <w:szCs w:val="18"/>
+              </w:rPr>
+              <w:t xml:space="preserve">keepalive</w:t>
+            </w:r>
+            <w:r>
+              <w:rPr>
+                <w:sz w:val="18"/>
+                <w:szCs w:val="18"/>
+              </w:rPr>
+              <w:t xml:space="preserve"> despierta a n8n</w:t>
             </w:r>
           </w:p>
         </w:tc>
@@ -6070,7 +6097,18 @@
       </w:r>
       <w:r>
         <w:rPr/>
-        <w:t xml:space="preserve">. El workflow espera la respuesta (*send and wait*).</w:t>
+        <w:t xml:space="preserve">. El workflow espera la respuesta (</w:t>
+      </w:r>
+      <w:r>
+        <w:rPr>
+          <w:i w:val="1"/>
+          <w:iCs w:val="1"/>
+        </w:rPr>
+        <w:t xml:space="preserve">send and wait</w:t>
+      </w:r>
+      <w:r>
+        <w:rPr/>
+        <w:t xml:space="preserve">).</w:t>
       </w:r>
     </w:p>
     <w:p>
@@ -9164,7 +9202,7 @@
                 <w:sz w:val="18"/>
                 <w:szCs w:val="18"/>
               </w:rPr>
-              <w:t xml:space="preserve">n8n en plan gratuito: se duerme y tiene 512 MB</w:t>
+              <w:t xml:space="preserve">Eventos antiguos de stock o de incidencias que llegan tarde</w:t>
             </w:r>
           </w:p>
         </w:tc>
@@ -9182,7 +9220,7 @@
                 <w:sz w:val="18"/>
                 <w:szCs w:val="18"/>
               </w:rPr>
-              <w:t xml:space="preserve">Cola con reintentos, *keepalive* cada 10 min y ajustes de memoria</w:t>
+              <w:t xml:space="preserve">Los duplicados se detectan en todos los eventos, pero solo los pedidos comparan la fecha del último evento aplicado</w:t>
             </w:r>
           </w:p>
         </w:tc>
@@ -9200,7 +9238,52 @@
                 <w:sz w:val="18"/>
                 <w:szCs w:val="18"/>
               </w:rPr>
-              <w:t xml:space="preserve">Plan de pago o modo cola con workers</w:t>
+              <w:t xml:space="preserve">Guardar </w:t>
+            </w:r>
+            <w:r>
+              <w:rPr>
+                <w:rFonts w:ascii="Courier New" w:hAnsi="Courier New" w:cs="Courier New"/>
+                <w:sz w:val="18"/>
+                <w:szCs w:val="18"/>
+              </w:rPr>
+              <w:t xml:space="preserve">last_event_at</w:t>
+            </w:r>
+            <w:r>
+              <w:rPr>
+                <w:sz w:val="18"/>
+                <w:szCs w:val="18"/>
+              </w:rPr>
+              <w:t xml:space="preserve"> en </w:t>
+            </w:r>
+            <w:r>
+              <w:rPr>
+                <w:rFonts w:ascii="Courier New" w:hAnsi="Courier New" w:cs="Courier New"/>
+                <w:sz w:val="18"/>
+                <w:szCs w:val="18"/>
+              </w:rPr>
+              <w:t xml:space="preserve">inventory</w:t>
+            </w:r>
+            <w:r>
+              <w:rPr>
+                <w:sz w:val="18"/>
+                <w:szCs w:val="18"/>
+              </w:rPr>
+              <w:t xml:space="preserve"> y </w:t>
+            </w:r>
+            <w:r>
+              <w:rPr>
+                <w:rFonts w:ascii="Courier New" w:hAnsi="Courier New" w:cs="Courier New"/>
+                <w:sz w:val="18"/>
+                <w:szCs w:val="18"/>
+              </w:rPr>
+              <w:t xml:space="preserve">tickets</w:t>
+            </w:r>
+            <w:r>
+              <w:rPr>
+                <w:sz w:val="18"/>
+                <w:szCs w:val="18"/>
+              </w:rPr>
+              <w:t xml:space="preserve"> y comparar igual que en los pedidos</w:t>
             </w:r>
           </w:p>
         </w:tc>
@@ -9223,7 +9306,7 @@
                 <w:sz w:val="18"/>
                 <w:szCs w:val="18"/>
               </w:rPr>
-              <w:t xml:space="preserve">El modelo de IA cambia o se satura (modelos retirados, errores 503)</w:t>
+              <w:t xml:space="preserve">n8n en plan gratuito: se duerme y tiene 512 MB</w:t>
             </w:r>
           </w:p>
         </w:tc>
@@ -9241,7 +9324,23 @@
                 <w:sz w:val="18"/>
                 <w:szCs w:val="18"/>
               </w:rPr>
-              <w:t xml:space="preserve">3 reintentos, tiempo máximo, validación del JSON y revisión manual si falla</w:t>
+              <w:t xml:space="preserve">Cola con reintentos, </w:t>
+            </w:r>
+            <w:r>
+              <w:rPr>
+                <w:i w:val="1"/>
+                <w:iCs w:val="1"/>
+                <w:sz w:val="18"/>
+                <w:szCs w:val="18"/>
+              </w:rPr>
+              <w:t xml:space="preserve">keepalive</w:t>
+            </w:r>
+            <w:r>
+              <w:rPr>
+                <w:sz w:val="18"/>
+                <w:szCs w:val="18"/>
+              </w:rPr>
+              <w:t xml:space="preserve"> cada 10 min y ajustes de memoria</w:t>
             </w:r>
           </w:p>
         </w:tc>
@@ -9259,7 +9358,7 @@
                 <w:sz w:val="18"/>
                 <w:szCs w:val="18"/>
               </w:rPr>
-              <w:t xml:space="preserve">Modelo de respaldo configurable y alertas por tasa de fallos</w:t>
+              <w:t xml:space="preserve">Plan de pago o modo cola con workers</w:t>
             </w:r>
           </w:p>
         </w:tc>
@@ -9282,7 +9381,7 @@
                 <w:sz w:val="18"/>
                 <w:szCs w:val="18"/>
               </w:rPr>
-              <w:t xml:space="preserve">La IA propone algo incorrecto</w:t>
+              <w:t xml:space="preserve">El modelo de IA cambia o se satura (modelos retirados, errores 503)</w:t>
             </w:r>
           </w:p>
         </w:tc>
@@ -9300,7 +9399,7 @@
                 <w:sz w:val="18"/>
                 <w:szCs w:val="18"/>
               </w:rPr>
-              <w:t xml:space="preserve">Revisión humana obligatoria, confianza y riesgos visibles, acciones limitadas</w:t>
+              <w:t xml:space="preserve">3 reintentos, tiempo máximo, validación del JSON y revisión manual si falla</w:t>
             </w:r>
           </w:p>
         </w:tc>
@@ -9318,7 +9417,7 @@
                 <w:sz w:val="18"/>
                 <w:szCs w:val="18"/>
               </w:rPr>
-              <w:t xml:space="preserve">Medir aprobaciones/rechazos para ajustar instrucciones</w:t>
+              <w:t xml:space="preserve">Modelo de respaldo configurable y alertas por tasa de fallos</w:t>
             </w:r>
           </w:p>
         </w:tc>
@@ -9341,7 +9440,7 @@
                 <w:sz w:val="18"/>
                 <w:szCs w:val="18"/>
               </w:rPr>
-              <w:t xml:space="preserve">Back-office académico sencillo (sin contabilidad ni compras)</w:t>
+              <w:t xml:space="preserve">La IA propone algo incorrecto</w:t>
             </w:r>
           </w:p>
         </w:tc>
@@ -9359,7 +9458,7 @@
                 <w:sz w:val="18"/>
                 <w:szCs w:val="18"/>
               </w:rPr>
-              <w:t xml:space="preserve">Sistema propio con su base de datos y usuarios; solo n8n escribe en él</w:t>
+              <w:t xml:space="preserve">Revisión humana obligatoria, confianza y riesgos visibles, acciones limitadas</w:t>
             </w:r>
           </w:p>
         </w:tc>
@@ -9377,7 +9476,7 @@
                 <w:sz w:val="18"/>
                 <w:szCs w:val="18"/>
               </w:rPr>
-              <w:t xml:space="preserve">Sustituir por un ERP real (p. ej., Odoo) con el mismo contrato, sin tocar la tienda</w:t>
+              <w:t xml:space="preserve">Medir aprobaciones/rechazos para ajustar instrucciones</w:t>
             </w:r>
           </w:p>
         </w:tc>
@@ -9400,7 +9499,7 @@
                 <w:sz w:val="18"/>
                 <w:szCs w:val="18"/>
               </w:rPr>
-              <w:t xml:space="preserve">Secretos expuestos por error</w:t>
+              <w:t xml:space="preserve">Back-office académico sencillo (sin contabilidad ni compras)</w:t>
             </w:r>
           </w:p>
         </w:tc>
@@ -9418,7 +9517,7 @@
                 <w:sz w:val="18"/>
                 <w:szCs w:val="18"/>
               </w:rPr>
-              <w:t xml:space="preserve">Credenciales cifradas en n8n y variables en Render; nada en el repositorio</w:t>
+              <w:t xml:space="preserve">Sistema propio con su base de datos y usuarios; solo n8n escribe en él</w:t>
             </w:r>
           </w:p>
         </w:tc>
@@ -9436,7 +9535,7 @@
                 <w:sz w:val="18"/>
                 <w:szCs w:val="18"/>
               </w:rPr>
-              <w:t xml:space="preserve">Rotación periódica del token del bot y del secreto del webhook</w:t>
+              <w:t xml:space="preserve">Sustituir por un ERP real (p. ej., Odoo) con el mismo contrato, sin tocar la tienda</w:t>
             </w:r>
           </w:p>
         </w:tc>
@@ -9459,7 +9558,7 @@
                 <w:sz w:val="18"/>
                 <w:szCs w:val="18"/>
               </w:rPr>
-              <w:t xml:space="preserve">Datos personales en Telegram</w:t>
+              <w:t xml:space="preserve">Secretos expuestos por error</w:t>
             </w:r>
           </w:p>
         </w:tc>
@@ -9477,7 +9576,7 @@
                 <w:sz w:val="18"/>
                 <w:szCs w:val="18"/>
               </w:rPr>
-              <w:t xml:space="preserve">Solo nombre de pila y número de incidencia; vinculación voluntaria con token</w:t>
+              <w:t xml:space="preserve">Credenciales cifradas en n8n y variables en Render; nada en el repositorio</w:t>
             </w:r>
           </w:p>
         </w:tc>
@@ -9485,6 +9584,65 @@
           <w:tcPr>
             <w:tcW w:w="2812" w:type="dxa"/>
             <w:shd w:val="clear" w:color="auto" w:fill="F2F5F9"/>
+          </w:tcPr>
+          <w:p>
+            <w:pPr>
+              <w:spacing w:before="0" w:after="0" w:line="240" w:lineRule="auto"/>
+            </w:pPr>
+            <w:r>
+              <w:rPr>
+                <w:sz w:val="18"/>
+                <w:szCs w:val="18"/>
+              </w:rPr>
+              <w:t xml:space="preserve">Rotación periódica del token del bot y del secreto del webhook</w:t>
+            </w:r>
+          </w:p>
+        </w:tc>
+      </w:tr>
+      <w:tr>
+        <w:trPr>
+          <w:cantSplit/>
+        </w:trPr>
+        <w:tc>
+          <w:tcPr>
+            <w:tcW w:w="2812" w:type="dxa"/>
+            <w:shd w:val="clear" w:color="auto" w:fill="FFFFFF"/>
+          </w:tcPr>
+          <w:p>
+            <w:pPr>
+              <w:spacing w:before="0" w:after="0" w:line="240" w:lineRule="auto"/>
+            </w:pPr>
+            <w:r>
+              <w:rPr>
+                <w:sz w:val="18"/>
+                <w:szCs w:val="18"/>
+              </w:rPr>
+              <w:t xml:space="preserve">Datos personales en Telegram</w:t>
+            </w:r>
+          </w:p>
+        </w:tc>
+        <w:tc>
+          <w:tcPr>
+            <w:tcW w:w="3164" w:type="dxa"/>
+            <w:shd w:val="clear" w:color="auto" w:fill="FFFFFF"/>
+          </w:tcPr>
+          <w:p>
+            <w:pPr>
+              <w:spacing w:before="0" w:after="0" w:line="240" w:lineRule="auto"/>
+            </w:pPr>
+            <w:r>
+              <w:rPr>
+                <w:sz w:val="18"/>
+                <w:szCs w:val="18"/>
+              </w:rPr>
+              <w:t xml:space="preserve">Solo nombre de pila y número de incidencia; vinculación voluntaria con token</w:t>
+            </w:r>
+          </w:p>
+        </w:tc>
+        <w:tc>
+          <w:tcPr>
+            <w:tcW w:w="2812" w:type="dxa"/>
+            <w:shd w:val="clear" w:color="auto" w:fill="FFFFFF"/>
           </w:tcPr>
           <w:p>
             <w:pPr>
@@ -10547,19 +10705,7 @@
       </w:r>
       <w:r>
         <w:rPr/>
-        <w:t xml:space="preserve"> diseñar el contrato de datos y el esquema </w:t>
-      </w:r>
-      <w:r>
-        <w:rPr>
-          <w:rFonts w:ascii="Courier New" w:hAnsi="Courier New" w:cs="Courier New"/>
-          <w:sz w:val="20"/>
-          <w:szCs w:val="20"/>
-        </w:rPr>
-        <w:t xml:space="preserve">erp</w:t>
-      </w:r>
-      <w:r>
-        <w:rPr/>
-        <w:t xml:space="preserve">, generar el SQL de la cola y las funciones, construir los workflows de n8n, redactar las instrucciones del agente, separar el back-office en un sistema propio con su web, montar un entorno local con dos bases de datos y simuladores de Supabase, Telegram y Gemini para probar los tres escenarios, y preparar la documentación, la matriz y el borrador de esta memoria.</w:t>
+        <w:t xml:space="preserve"> diseñar el contrato de datos y el back-office, generar el SQL de la cola y las funciones, construir los workflows de n8n, redactar las instrucciones del agente, separar el back-office en un sistema propio con su web, montar un entorno local con dos bases de datos y simuladores de Supabase, Telegram y Gemini para probar los tres escenarios, y preparar la documentación, la matriz y el borrador de esta memoria.</w:t>
       </w:r>
     </w:p>
     <w:p>
@@ -10601,7 +10747,7 @@
       </w:r>
       <w:r>
         <w:rPr/>
-        <w:t xml:space="preserve"> compras, cambios de estado e incidencias reales en la tienda publicada, revisando el ERP, la cola, el log, el historial de ejecuciones de n8n y los mensajes de Telegram, y enviando el payload de error para comprobar el </w:t>
+        <w:t xml:space="preserve"> compras, cambios de estado e incidencias reales en la tienda publicada, revisando el ERP, la cola, el log, el historial de ejecuciones de n8n y los mensajes de Telegram, y, en el entorno local, enviando los payloads de error para comprobar el </w:t>
       </w:r>
       <w:r>
         <w:rPr>
@@ -10829,7 +10975,23 @@
                 <w:sz w:val="18"/>
                 <w:szCs w:val="18"/>
               </w:rPr>
-              <w:t xml:space="preserve">n8n no arrancaba en Render (status 134, *timeouts*)</w:t>
+              <w:t xml:space="preserve">n8n no arrancaba en Render (status 134, </w:t>
+            </w:r>
+            <w:r>
+              <w:rPr>
+                <w:i w:val="1"/>
+                <w:iCs w:val="1"/>
+                <w:sz w:val="18"/>
+                <w:szCs w:val="18"/>
+              </w:rPr>
+              <w:t xml:space="preserve">timeouts</w:t>
+            </w:r>
+            <w:r>
+              <w:rPr>
+                <w:sz w:val="18"/>
+                <w:szCs w:val="18"/>
+              </w:rPr>
+              <w:t xml:space="preserve">)</w:t>
             </w:r>
           </w:p>
         </w:tc>
@@ -10865,7 +11027,23 @@
                 <w:sz w:val="18"/>
                 <w:szCs w:val="18"/>
               </w:rPr>
-              <w:t xml:space="preserve">Límite de memoria de Node, *timeout* de BD de 60 s y menos concurrencia (</w:t>
+              <w:t xml:space="preserve">Límite de memoria de Node, </w:t>
+            </w:r>
+            <w:r>
+              <w:rPr>
+                <w:i w:val="1"/>
+                <w:iCs w:val="1"/>
+                <w:sz w:val="18"/>
+                <w:szCs w:val="18"/>
+              </w:rPr>
+              <w:t xml:space="preserve">timeout</w:t>
+            </w:r>
+            <w:r>
+              <w:rPr>
+                <w:sz w:val="18"/>
+                <w:szCs w:val="18"/>
+              </w:rPr>
+              <w:t xml:space="preserve"> de BD de 60 s y menos concurrencia (</w:t>
             </w:r>
             <w:r>
               <w:rPr>
@@ -11151,7 +11329,23 @@
                 <w:sz w:val="18"/>
                 <w:szCs w:val="18"/>
               </w:rPr>
-              <w:t xml:space="preserve">El *Structured Output Parser* de n8n no terminaba con Gemini 3.x</w:t>
+              <w:t xml:space="preserve">El </w:t>
+            </w:r>
+            <w:r>
+              <w:rPr>
+                <w:i w:val="1"/>
+                <w:iCs w:val="1"/>
+                <w:sz w:val="18"/>
+                <w:szCs w:val="18"/>
+              </w:rPr>
+              <w:t xml:space="preserve">Structured Output Parser</w:t>
+            </w:r>
+            <w:r>
+              <w:rPr>
+                <w:sz w:val="18"/>
+                <w:szCs w:val="18"/>
+              </w:rPr>
+              <w:t xml:space="preserve"> de n8n no terminaba con Gemini 3.x</w:t>
             </w:r>
           </w:p>
         </w:tc>

</xml_diff>

<commit_message>
Memoria: indicadores justificados con su objetivo y cuadro de mando con los gráficos nuevos
Co-Authored-By: Claude Opus 5.5 <noreply@anthropic.com>
Claude-Session: https://claude.ai/code/session_018RfQFTr8FjC9r6pjyYQgv4
</commit_message>
<xml_diff>
--- a/docs/tarea2/Memoria_Tarea2_Entrelibros.docx
+++ b/docs/tarea2/Memoria_Tarea2_Entrelibros.docx
@@ -6358,9 +6358,10 @@
         </w:tblCellMar>
       </w:tblPr>
       <w:tblGrid>
+        <w:gridCol w:w="2285"/>
         <w:gridCol w:w="2636"/>
-        <w:gridCol w:w="3515"/>
-        <w:gridCol w:w="2637"/>
+        <w:gridCol w:w="2636"/>
+        <w:gridCol w:w="1231"/>
       </w:tblGrid>
       <w:tr>
         <w:trPr>
@@ -6369,6 +6370,27 @@
         </w:trPr>
         <w:tc>
           <w:tcPr>
+            <w:tcW w:w="2285" w:type="dxa"/>
+            <w:shd w:val="clear" w:color="auto" w:fill="004379"/>
+          </w:tcPr>
+          <w:p>
+            <w:pPr>
+              <w:spacing w:before="0" w:after="0" w:line="240" w:lineRule="auto"/>
+            </w:pPr>
+            <w:r>
+              <w:rPr>
+                <w:b w:val="1"/>
+                <w:bCs w:val="1"/>
+                <w:color w:val="FFFFFF"/>
+                <w:sz w:val="18"/>
+                <w:szCs w:val="18"/>
+              </w:rPr>
+              <w:t xml:space="preserve">Métrica</w:t>
+            </w:r>
+          </w:p>
+        </w:tc>
+        <w:tc>
+          <w:tcPr>
             <w:tcW w:w="2636" w:type="dxa"/>
             <w:shd w:val="clear" w:color="auto" w:fill="004379"/>
           </w:tcPr>
@@ -6384,13 +6406,13 @@
                 <w:sz w:val="18"/>
                 <w:szCs w:val="18"/>
               </w:rPr>
-              <w:t xml:space="preserve">Métrica</w:t>
-            </w:r>
-          </w:p>
-        </w:tc>
-        <w:tc>
-          <w:tcPr>
-            <w:tcW w:w="3515" w:type="dxa"/>
+              <w:t xml:space="preserve">Cómo se calcula</w:t>
+            </w:r>
+          </w:p>
+        </w:tc>
+        <w:tc>
+          <w:tcPr>
+            <w:tcW w:w="2636" w:type="dxa"/>
             <w:shd w:val="clear" w:color="auto" w:fill="004379"/>
           </w:tcPr>
           <w:p>
@@ -6405,13 +6427,13 @@
                 <w:sz w:val="18"/>
                 <w:szCs w:val="18"/>
               </w:rPr>
-              <w:t xml:space="preserve">Cómo se calcula</w:t>
-            </w:r>
-          </w:p>
-        </w:tc>
-        <w:tc>
-          <w:tcPr>
-            <w:tcW w:w="2637" w:type="dxa"/>
+              <w:t xml:space="preserve">Por qué la medimos</w:t>
+            </w:r>
+          </w:p>
+        </w:tc>
+        <w:tc>
+          <w:tcPr>
+            <w:tcW w:w="1231" w:type="dxa"/>
             <w:shd w:val="clear" w:color="auto" w:fill="004379"/>
           </w:tcPr>
           <w:p>
@@ -6426,7 +6448,7 @@
                 <w:sz w:val="18"/>
                 <w:szCs w:val="18"/>
               </w:rPr>
-              <w:t xml:space="preserve">Para qué sirve</w:t>
+              <w:t xml:space="preserve">Objetivo</w:t>
             </w:r>
           </w:p>
         </w:tc>
@@ -6437,6 +6459,24 @@
         </w:trPr>
         <w:tc>
           <w:tcPr>
+            <w:tcW w:w="2285" w:type="dxa"/>
+            <w:shd w:val="clear" w:color="auto" w:fill="FFFFFF"/>
+          </w:tcPr>
+          <w:p>
+            <w:pPr>
+              <w:spacing w:before="0" w:after="0" w:line="240" w:lineRule="auto"/>
+            </w:pPr>
+            <w:r>
+              <w:rPr>
+                <w:sz w:val="18"/>
+                <w:szCs w:val="18"/>
+              </w:rPr>
+              <w:t xml:space="preserve">Eventos aplicados (%), duplicados y obsoletos</w:t>
+            </w:r>
+          </w:p>
+        </w:tc>
+        <w:tc>
+          <w:tcPr>
             <w:tcW w:w="2636" w:type="dxa"/>
             <w:shd w:val="clear" w:color="auto" w:fill="FFFFFF"/>
           </w:tcPr>
@@ -6446,61 +6486,69 @@
             </w:pPr>
             <w:r>
               <w:rPr>
-                <w:sz w:val="18"/>
-                <w:szCs w:val="18"/>
-              </w:rPr>
-              <w:t xml:space="preserve">Pedidos de venta e importe pagado</w:t>
-            </w:r>
-          </w:p>
-        </w:tc>
-        <w:tc>
-          <w:tcPr>
-            <w:tcW w:w="3515" w:type="dxa"/>
-            <w:shd w:val="clear" w:color="auto" w:fill="FFFFFF"/>
-          </w:tcPr>
-          <w:p>
-            <w:pPr>
-              <w:spacing w:before="0" w:after="0" w:line="240" w:lineRule="auto"/>
-            </w:pPr>
-            <w:r>
-              <w:rPr>
-                <w:sz w:val="18"/>
-                <w:szCs w:val="18"/>
-              </w:rPr>
-              <w:t xml:space="preserve">Filas de </w:t>
-            </w:r>
-            <w:r>
-              <w:rPr>
                 <w:rFonts w:ascii="Courier New" w:hAnsi="Courier New" w:cs="Courier New"/>
                 <w:sz w:val="18"/>
                 <w:szCs w:val="18"/>
               </w:rPr>
-              <w:t xml:space="preserve">sales_orders</w:t>
-            </w:r>
-            <w:r>
-              <w:rPr>
-                <w:sz w:val="18"/>
-                <w:szCs w:val="18"/>
-              </w:rPr>
-              <w:t xml:space="preserve"> y suma de las pagadas</w:t>
-            </w:r>
-          </w:p>
-        </w:tc>
-        <w:tc>
-          <w:tcPr>
-            <w:tcW w:w="2637" w:type="dxa"/>
-            <w:shd w:val="clear" w:color="auto" w:fill="FFFFFF"/>
-          </w:tcPr>
-          <w:p>
-            <w:pPr>
-              <w:spacing w:before="0" w:after="0" w:line="240" w:lineRule="auto"/>
-            </w:pPr>
-            <w:r>
-              <w:rPr>
-                <w:sz w:val="18"/>
-                <w:szCs w:val="18"/>
-              </w:rPr>
-              <w:t xml:space="preserve">Comprobar que lo vendido llega al back-office</w:t>
+              <w:t xml:space="preserve">integration_log</w:t>
+            </w:r>
+            <w:r>
+              <w:rPr>
+                <w:sz w:val="18"/>
+                <w:szCs w:val="18"/>
+              </w:rPr>
+              <w:t xml:space="preserve"> (paso </w:t>
+            </w:r>
+            <w:r>
+              <w:rPr>
+                <w:rFonts w:ascii="Courier New" w:hAnsi="Courier New" w:cs="Courier New"/>
+                <w:sz w:val="18"/>
+                <w:szCs w:val="18"/>
+              </w:rPr>
+              <w:t xml:space="preserve">resultado</w:t>
+            </w:r>
+            <w:r>
+              <w:rPr>
+                <w:sz w:val="18"/>
+                <w:szCs w:val="18"/>
+              </w:rPr>
+              <w:t xml:space="preserve">) por estado</w:t>
+            </w:r>
+          </w:p>
+        </w:tc>
+        <w:tc>
+          <w:tcPr>
+            <w:tcW w:w="2636" w:type="dxa"/>
+            <w:shd w:val="clear" w:color="auto" w:fill="FFFFFF"/>
+          </w:tcPr>
+          <w:p>
+            <w:pPr>
+              <w:spacing w:before="0" w:after="0" w:line="240" w:lineRule="auto"/>
+            </w:pPr>
+            <w:r>
+              <w:rPr>
+                <w:sz w:val="18"/>
+                <w:szCs w:val="18"/>
+              </w:rPr>
+              <w:t xml:space="preserve">Fiabilidad: si baja, hay datos de la tienda que no han llegado</w:t>
+            </w:r>
+          </w:p>
+        </w:tc>
+        <w:tc>
+          <w:tcPr>
+            <w:tcW w:w="1231" w:type="dxa"/>
+            <w:shd w:val="clear" w:color="auto" w:fill="FFFFFF"/>
+          </w:tcPr>
+          <w:p>
+            <w:pPr>
+              <w:spacing w:before="0" w:after="0" w:line="240" w:lineRule="auto"/>
+            </w:pPr>
+            <w:r>
+              <w:rPr>
+                <w:sz w:val="18"/>
+                <w:szCs w:val="18"/>
+              </w:rPr>
+              <w:t xml:space="preserve">≥ 99 %</w:t>
             </w:r>
           </w:p>
         </w:tc>
@@ -6511,6 +6559,24 @@
         </w:trPr>
         <w:tc>
           <w:tcPr>
+            <w:tcW w:w="2285" w:type="dxa"/>
+            <w:shd w:val="clear" w:color="auto" w:fill="F2F5F9"/>
+          </w:tcPr>
+          <w:p>
+            <w:pPr>
+              <w:spacing w:before="0" w:after="0" w:line="240" w:lineRule="auto"/>
+            </w:pPr>
+            <w:r>
+              <w:rPr>
+                <w:sz w:val="18"/>
+                <w:szCs w:val="18"/>
+              </w:rPr>
+              <w:t xml:space="preserve">Latencia tienda → back-office</w:t>
+            </w:r>
+          </w:p>
+        </w:tc>
+        <w:tc>
+          <w:tcPr>
             <w:tcW w:w="2636" w:type="dxa"/>
             <w:shd w:val="clear" w:color="auto" w:fill="F2F5F9"/>
           </w:tcPr>
@@ -6523,13 +6589,13 @@
                 <w:sz w:val="18"/>
                 <w:szCs w:val="18"/>
               </w:rPr>
-              <w:t xml:space="preserve">Eventos aplicados (%), duplicados y obsoletos</w:t>
-            </w:r>
-          </w:p>
-        </w:tc>
-        <w:tc>
-          <w:tcPr>
-            <w:tcW w:w="3515" w:type="dxa"/>
+              <w:t xml:space="preserve">Fecha de aplicación − fecha del evento en la tienda</w:t>
+            </w:r>
+          </w:p>
+        </w:tc>
+        <w:tc>
+          <w:tcPr>
+            <w:tcW w:w="2636" w:type="dxa"/>
             <w:shd w:val="clear" w:color="auto" w:fill="F2F5F9"/>
           </w:tcPr>
           <w:p>
@@ -6538,39 +6604,16 @@
             </w:pPr>
             <w:r>
               <w:rPr>
-                <w:rFonts w:ascii="Courier New" w:hAnsi="Courier New" w:cs="Courier New"/>
-                <w:sz w:val="18"/>
-                <w:szCs w:val="18"/>
-              </w:rPr>
-              <w:t xml:space="preserve">integration_log</w:t>
-            </w:r>
-            <w:r>
-              <w:rPr>
-                <w:sz w:val="18"/>
-                <w:szCs w:val="18"/>
-              </w:rPr>
-              <w:t xml:space="preserve"> (paso </w:t>
-            </w:r>
-            <w:r>
-              <w:rPr>
-                <w:rFonts w:ascii="Courier New" w:hAnsi="Courier New" w:cs="Courier New"/>
-                <w:sz w:val="18"/>
-                <w:szCs w:val="18"/>
-              </w:rPr>
-              <w:t xml:space="preserve">resultado</w:t>
-            </w:r>
-            <w:r>
-              <w:rPr>
-                <w:sz w:val="18"/>
-                <w:szCs w:val="18"/>
-              </w:rPr>
-              <w:t xml:space="preserve">) por estado</w:t>
-            </w:r>
-          </w:p>
-        </w:tc>
-        <w:tc>
-          <w:tcPr>
-            <w:tcW w:w="2637" w:type="dxa"/>
+                <w:sz w:val="18"/>
+                <w:szCs w:val="18"/>
+              </w:rPr>
+              <w:t xml:space="preserve">Con retraso, el back-office ve tarde pedidos y stock</w:t>
+            </w:r>
+          </w:p>
+        </w:tc>
+        <w:tc>
+          <w:tcPr>
+            <w:tcW w:w="1231" w:type="dxa"/>
             <w:shd w:val="clear" w:color="auto" w:fill="F2F5F9"/>
           </w:tcPr>
           <w:p>
@@ -6582,7 +6625,7 @@
                 <w:sz w:val="18"/>
                 <w:szCs w:val="18"/>
               </w:rPr>
-              <w:t xml:space="preserve">Fiabilidad de la integración</w:t>
+              <w:t xml:space="preserve">&lt; 60 s (Render tarda ~50 s en despertar)</w:t>
             </w:r>
           </w:p>
         </w:tc>
@@ -6593,6 +6636,24 @@
         </w:trPr>
         <w:tc>
           <w:tcPr>
+            <w:tcW w:w="2285" w:type="dxa"/>
+            <w:shd w:val="clear" w:color="auto" w:fill="FFFFFF"/>
+          </w:tcPr>
+          <w:p>
+            <w:pPr>
+              <w:spacing w:before="0" w:after="0" w:line="240" w:lineRule="auto"/>
+            </w:pPr>
+            <w:r>
+              <w:rPr>
+                <w:sz w:val="18"/>
+                <w:szCs w:val="18"/>
+              </w:rPr>
+              <w:t xml:space="preserve">Errores, por tipo</w:t>
+            </w:r>
+          </w:p>
+        </w:tc>
+        <w:tc>
+          <w:tcPr>
             <w:tcW w:w="2636" w:type="dxa"/>
             <w:shd w:val="clear" w:color="auto" w:fill="FFFFFF"/>
           </w:tcPr>
@@ -6602,24 +6663,6 @@
             </w:pPr>
             <w:r>
               <w:rPr>
-                <w:sz w:val="18"/>
-                <w:szCs w:val="18"/>
-              </w:rPr>
-              <w:t xml:space="preserve">Errores registrados, por tipo</w:t>
-            </w:r>
-          </w:p>
-        </w:tc>
-        <w:tc>
-          <w:tcPr>
-            <w:tcW w:w="3515" w:type="dxa"/>
-            <w:shd w:val="clear" w:color="auto" w:fill="FFFFFF"/>
-          </w:tcPr>
-          <w:p>
-            <w:pPr>
-              <w:spacing w:before="0" w:after="0" w:line="240" w:lineRule="auto"/>
-            </w:pPr>
-            <w:r>
-              <w:rPr>
                 <w:rFonts w:ascii="Courier New" w:hAnsi="Courier New" w:cs="Courier New"/>
                 <w:sz w:val="18"/>
                 <w:szCs w:val="18"/>
@@ -6646,7 +6689,7 @@
                 <w:sz w:val="18"/>
                 <w:szCs w:val="18"/>
               </w:rPr>
-              <w:t xml:space="preserve">, agrupado por </w:t>
+              <w:t xml:space="preserve"> por </w:t>
             </w:r>
             <w:r>
               <w:rPr>
@@ -6660,19 +6703,37 @@
         </w:tc>
         <w:tc>
           <w:tcPr>
-            <w:tcW w:w="2637" w:type="dxa"/>
-            <w:shd w:val="clear" w:color="auto" w:fill="FFFFFF"/>
-          </w:tcPr>
-          <w:p>
-            <w:pPr>
-              <w:spacing w:before="0" w:after="0" w:line="240" w:lineRule="auto"/>
-            </w:pPr>
-            <w:r>
-              <w:rPr>
-                <w:sz w:val="18"/>
-                <w:szCs w:val="18"/>
-              </w:rPr>
-              <w:t xml:space="preserve">Saber qué falla y dónde</w:t>
+            <w:tcW w:w="2636" w:type="dxa"/>
+            <w:shd w:val="clear" w:color="auto" w:fill="FFFFFF"/>
+          </w:tcPr>
+          <w:p>
+            <w:pPr>
+              <w:spacing w:before="0" w:after="0" w:line="240" w:lineRule="auto"/>
+            </w:pPr>
+            <w:r>
+              <w:rPr>
+                <w:sz w:val="18"/>
+                <w:szCs w:val="18"/>
+              </w:rPr>
+              <w:t xml:space="preserve">Dice dónde actuar: datos de la tienda, n8n o el agente</w:t>
+            </w:r>
+          </w:p>
+        </w:tc>
+        <w:tc>
+          <w:tcPr>
+            <w:tcW w:w="1231" w:type="dxa"/>
+            <w:shd w:val="clear" w:color="auto" w:fill="FFFFFF"/>
+          </w:tcPr>
+          <w:p>
+            <w:pPr>
+              <w:spacing w:before="0" w:after="0" w:line="240" w:lineRule="auto"/>
+            </w:pPr>
+            <w:r>
+              <w:rPr>
+                <w:sz w:val="18"/>
+                <w:szCs w:val="18"/>
+              </w:rPr>
+              <w:t xml:space="preserve">0 técnicos sin reintento</w:t>
             </w:r>
           </w:p>
         </w:tc>
@@ -6683,6 +6744,24 @@
         </w:trPr>
         <w:tc>
           <w:tcPr>
+            <w:tcW w:w="2285" w:type="dxa"/>
+            <w:shd w:val="clear" w:color="auto" w:fill="F2F5F9"/>
+          </w:tcPr>
+          <w:p>
+            <w:pPr>
+              <w:spacing w:before="0" w:after="0" w:line="240" w:lineRule="auto"/>
+            </w:pPr>
+            <w:r>
+              <w:rPr>
+                <w:sz w:val="18"/>
+                <w:szCs w:val="18"/>
+              </w:rPr>
+              <w:t xml:space="preserve">Pedidos de venta e importe</w:t>
+            </w:r>
+          </w:p>
+        </w:tc>
+        <w:tc>
+          <w:tcPr>
             <w:tcW w:w="2636" w:type="dxa"/>
             <w:shd w:val="clear" w:color="auto" w:fill="F2F5F9"/>
           </w:tcPr>
@@ -6695,13 +6774,28 @@
                 <w:sz w:val="18"/>
                 <w:szCs w:val="18"/>
               </w:rPr>
-              <w:t xml:space="preserve">Latencia tienda → back-office</w:t>
-            </w:r>
-          </w:p>
-        </w:tc>
-        <w:tc>
-          <w:tcPr>
-            <w:tcW w:w="3515" w:type="dxa"/>
+              <w:t xml:space="preserve">Filas de </w:t>
+            </w:r>
+            <w:r>
+              <w:rPr>
+                <w:rFonts w:ascii="Courier New" w:hAnsi="Courier New" w:cs="Courier New"/>
+                <w:sz w:val="18"/>
+                <w:szCs w:val="18"/>
+              </w:rPr>
+              <w:t xml:space="preserve">sales_orders</w:t>
+            </w:r>
+            <w:r>
+              <w:rPr>
+                <w:sz w:val="18"/>
+                <w:szCs w:val="18"/>
+              </w:rPr>
+              <w:t xml:space="preserve"> y suma de las pagadas</w:t>
+            </w:r>
+          </w:p>
+        </w:tc>
+        <w:tc>
+          <w:tcPr>
+            <w:tcW w:w="2636" w:type="dxa"/>
             <w:shd w:val="clear" w:color="auto" w:fill="F2F5F9"/>
           </w:tcPr>
           <w:p>
@@ -6713,13 +6807,13 @@
                 <w:sz w:val="18"/>
                 <w:szCs w:val="18"/>
               </w:rPr>
-              <w:t xml:space="preserve">Fecha de aplicación en el back-office − fecha del evento en la tienda</w:t>
-            </w:r>
-          </w:p>
-        </w:tc>
-        <w:tc>
-          <w:tcPr>
-            <w:tcW w:w="2637" w:type="dxa"/>
+              <w:t xml:space="preserve">Base de la facturación: el ERP debe reflejar la venta real</w:t>
+            </w:r>
+          </w:p>
+        </w:tc>
+        <w:tc>
+          <w:tcPr>
+            <w:tcW w:w="1231" w:type="dxa"/>
             <w:shd w:val="clear" w:color="auto" w:fill="F2F5F9"/>
           </w:tcPr>
           <w:p>
@@ -6731,7 +6825,7 @@
                 <w:sz w:val="18"/>
                 <w:szCs w:val="18"/>
               </w:rPr>
-              <w:t xml:space="preserve">Detectar retrasos (p. ej., n8n dormido)</w:t>
+              <w:t xml:space="preserve">Igual que en la tienda</w:t>
             </w:r>
           </w:p>
         </w:tc>
@@ -6742,6 +6836,24 @@
         </w:trPr>
         <w:tc>
           <w:tcPr>
+            <w:tcW w:w="2285" w:type="dxa"/>
+            <w:shd w:val="clear" w:color="auto" w:fill="FFFFFF"/>
+          </w:tcPr>
+          <w:p>
+            <w:pPr>
+              <w:spacing w:before="0" w:after="0" w:line="240" w:lineRule="auto"/>
+            </w:pPr>
+            <w:r>
+              <w:rPr>
+                <w:sz w:val="18"/>
+                <w:szCs w:val="18"/>
+              </w:rPr>
+              <w:t xml:space="preserve">Incidencias abiertas y resolución media</w:t>
+            </w:r>
+          </w:p>
+        </w:tc>
+        <w:tc>
+          <w:tcPr>
             <w:tcW w:w="2636" w:type="dxa"/>
             <w:shd w:val="clear" w:color="auto" w:fill="FFFFFF"/>
           </w:tcPr>
@@ -6751,24 +6863,6 @@
             </w:pPr>
             <w:r>
               <w:rPr>
-                <w:sz w:val="18"/>
-                <w:szCs w:val="18"/>
-              </w:rPr>
-              <w:t xml:space="preserve">Incidencias abiertas y resolución media</w:t>
-            </w:r>
-          </w:p>
-        </w:tc>
-        <w:tc>
-          <w:tcPr>
-            <w:tcW w:w="3515" w:type="dxa"/>
-            <w:shd w:val="clear" w:color="auto" w:fill="FFFFFF"/>
-          </w:tcPr>
-          <w:p>
-            <w:pPr>
-              <w:spacing w:before="0" w:after="0" w:line="240" w:lineRule="auto"/>
-            </w:pPr>
-            <w:r>
-              <w:rPr>
                 <w:rFonts w:ascii="Courier New" w:hAnsi="Courier New" w:cs="Courier New"/>
                 <w:sz w:val="18"/>
                 <w:szCs w:val="18"/>
@@ -6786,19 +6880,37 @@
         </w:tc>
         <w:tc>
           <w:tcPr>
-            <w:tcW w:w="2637" w:type="dxa"/>
-            <w:shd w:val="clear" w:color="auto" w:fill="FFFFFF"/>
-          </w:tcPr>
-          <w:p>
-            <w:pPr>
-              <w:spacing w:before="0" w:after="0" w:line="240" w:lineRule="auto"/>
-            </w:pPr>
-            <w:r>
-              <w:rPr>
-                <w:sz w:val="18"/>
-                <w:szCs w:val="18"/>
-              </w:rPr>
-              <w:t xml:space="preserve">Carga de soporte y nivel de servicio</w:t>
+            <w:tcW w:w="2636" w:type="dxa"/>
+            <w:shd w:val="clear" w:color="auto" w:fill="FFFFFF"/>
+          </w:tcPr>
+          <w:p>
+            <w:pPr>
+              <w:spacing w:before="0" w:after="0" w:line="240" w:lineRule="auto"/>
+            </w:pPr>
+            <w:r>
+              <w:rPr>
+                <w:sz w:val="18"/>
+                <w:szCs w:val="18"/>
+              </w:rPr>
+              <w:t xml:space="preserve">Carga de soporte y plazo prometido al cliente</w:t>
+            </w:r>
+          </w:p>
+        </w:tc>
+        <w:tc>
+          <w:tcPr>
+            <w:tcW w:w="1231" w:type="dxa"/>
+            <w:shd w:val="clear" w:color="auto" w:fill="FFFFFF"/>
+          </w:tcPr>
+          <w:p>
+            <w:pPr>
+              <w:spacing w:before="0" w:after="0" w:line="240" w:lineRule="auto"/>
+            </w:pPr>
+            <w:r>
+              <w:rPr>
+                <w:sz w:val="18"/>
+                <w:szCs w:val="18"/>
+              </w:rPr>
+              <w:t xml:space="preserve">24, 48 o 72 h según el tipo</w:t>
             </w:r>
           </w:p>
         </w:tc>
@@ -6809,6 +6921,24 @@
         </w:trPr>
         <w:tc>
           <w:tcPr>
+            <w:tcW w:w="2285" w:type="dxa"/>
+            <w:shd w:val="clear" w:color="auto" w:fill="F2F5F9"/>
+          </w:tcPr>
+          <w:p>
+            <w:pPr>
+              <w:spacing w:before="0" w:after="0" w:line="240" w:lineRule="auto"/>
+            </w:pPr>
+            <w:r>
+              <w:rPr>
+                <w:sz w:val="18"/>
+                <w:szCs w:val="18"/>
+              </w:rPr>
+              <w:t xml:space="preserve">Propuestas del agente</w:t>
+            </w:r>
+          </w:p>
+        </w:tc>
+        <w:tc>
+          <w:tcPr>
             <w:tcW w:w="2636" w:type="dxa"/>
             <w:shd w:val="clear" w:color="auto" w:fill="F2F5F9"/>
           </w:tcPr>
@@ -6821,13 +6951,13 @@
                 <w:sz w:val="18"/>
                 <w:szCs w:val="18"/>
               </w:rPr>
-              <w:t xml:space="preserve">Propuestas del agente</w:t>
-            </w:r>
-          </w:p>
-        </w:tc>
-        <w:tc>
-          <w:tcPr>
-            <w:tcW w:w="3515" w:type="dxa"/>
+              <w:t xml:space="preserve">Aprobadas, rechazadas, pendientes y confianza media</w:t>
+            </w:r>
+          </w:p>
+        </w:tc>
+        <w:tc>
+          <w:tcPr>
+            <w:tcW w:w="2636" w:type="dxa"/>
             <w:shd w:val="clear" w:color="auto" w:fill="F2F5F9"/>
           </w:tcPr>
           <w:p>
@@ -6839,13 +6969,13 @@
                 <w:sz w:val="18"/>
                 <w:szCs w:val="18"/>
               </w:rPr>
-              <w:t xml:space="preserve">Aprobadas, rechazadas, pendientes y confianza media</w:t>
-            </w:r>
-          </w:p>
-        </w:tc>
-        <w:tc>
-          <w:tcPr>
-            <w:tcW w:w="2637" w:type="dxa"/>
+              <w:t xml:space="preserve">Calidad del agente: si caen, revisar sus instrucciones</w:t>
+            </w:r>
+          </w:p>
+        </w:tc>
+        <w:tc>
+          <w:tcPr>
+            <w:tcW w:w="1231" w:type="dxa"/>
             <w:shd w:val="clear" w:color="auto" w:fill="F2F5F9"/>
           </w:tcPr>
           <w:p>
@@ -6857,7 +6987,7 @@
                 <w:sz w:val="18"/>
                 <w:szCs w:val="18"/>
               </w:rPr>
-              <w:t xml:space="preserve">Calidad del agente y peso de la revisión humana</w:t>
+              <w:t xml:space="preserve">≥ 80 % aprobadas</w:t>
             </w:r>
           </w:p>
         </w:tc>
@@ -6868,6 +6998,24 @@
         </w:trPr>
         <w:tc>
           <w:tcPr>
+            <w:tcW w:w="2285" w:type="dxa"/>
+            <w:shd w:val="clear" w:color="auto" w:fill="FFFFFF"/>
+          </w:tcPr>
+          <w:p>
+            <w:pPr>
+              <w:spacing w:before="0" w:after="0" w:line="240" w:lineRule="auto"/>
+            </w:pPr>
+            <w:r>
+              <w:rPr>
+                <w:sz w:val="18"/>
+                <w:szCs w:val="18"/>
+              </w:rPr>
+              <w:t xml:space="preserve">Inventario</w:t>
+            </w:r>
+          </w:p>
+        </w:tc>
+        <w:tc>
+          <w:tcPr>
             <w:tcW w:w="2636" w:type="dxa"/>
             <w:shd w:val="clear" w:color="auto" w:fill="FFFFFF"/>
           </w:tcPr>
@@ -6880,43 +7028,43 @@
                 <w:sz w:val="18"/>
                 <w:szCs w:val="18"/>
               </w:rPr>
-              <w:t xml:space="preserve">Inventario</w:t>
-            </w:r>
-          </w:p>
-        </w:tc>
-        <w:tc>
-          <w:tcPr>
-            <w:tcW w:w="3515" w:type="dxa"/>
-            <w:shd w:val="clear" w:color="auto" w:fill="FFFFFF"/>
-          </w:tcPr>
-          <w:p>
-            <w:pPr>
-              <w:spacing w:before="0" w:after="0" w:line="240" w:lineRule="auto"/>
-            </w:pPr>
-            <w:r>
-              <w:rPr>
-                <w:sz w:val="18"/>
-                <w:szCs w:val="18"/>
-              </w:rPr>
               <w:t xml:space="preserve">SKU, unidades y artículos con menos de 5 unidades</w:t>
             </w:r>
           </w:p>
         </w:tc>
         <w:tc>
           <w:tcPr>
-            <w:tcW w:w="2637" w:type="dxa"/>
-            <w:shd w:val="clear" w:color="auto" w:fill="FFFFFF"/>
-          </w:tcPr>
-          <w:p>
-            <w:pPr>
-              <w:spacing w:before="0" w:after="0" w:line="240" w:lineRule="auto"/>
-            </w:pPr>
-            <w:r>
-              <w:rPr>
-                <w:sz w:val="18"/>
-                <w:szCs w:val="18"/>
-              </w:rPr>
-              <w:t xml:space="preserve">Detectar falta de recambios</w:t>
+            <w:tcW w:w="2636" w:type="dxa"/>
+            <w:shd w:val="clear" w:color="auto" w:fill="FFFFFF"/>
+          </w:tcPr>
+          <w:p>
+            <w:pPr>
+              <w:spacing w:before="0" w:after="0" w:line="240" w:lineRule="auto"/>
+            </w:pPr>
+            <w:r>
+              <w:rPr>
+                <w:sz w:val="18"/>
+                <w:szCs w:val="18"/>
+              </w:rPr>
+              <w:t xml:space="preserve">Reponer antes de tener que cancelar pedidos</w:t>
+            </w:r>
+          </w:p>
+        </w:tc>
+        <w:tc>
+          <w:tcPr>
+            <w:tcW w:w="1231" w:type="dxa"/>
+            <w:shd w:val="clear" w:color="auto" w:fill="FFFFFF"/>
+          </w:tcPr>
+          <w:p>
+            <w:pPr>
+              <w:spacing w:before="0" w:after="0" w:line="240" w:lineRule="auto"/>
+            </w:pPr>
+            <w:r>
+              <w:rPr>
+                <w:sz w:val="18"/>
+                <w:szCs w:val="18"/>
+              </w:rPr>
+              <w:t xml:space="preserve">0 SKU bajo 5 uds.</w:t>
             </w:r>
           </w:p>
         </w:tc>
@@ -6927,6 +7075,24 @@
         </w:trPr>
         <w:tc>
           <w:tcPr>
+            <w:tcW w:w="2285" w:type="dxa"/>
+            <w:shd w:val="clear" w:color="auto" w:fill="F2F5F9"/>
+          </w:tcPr>
+          <w:p>
+            <w:pPr>
+              <w:spacing w:before="0" w:after="0" w:line="240" w:lineRule="auto"/>
+            </w:pPr>
+            <w:r>
+              <w:rPr>
+                <w:sz w:val="18"/>
+                <w:szCs w:val="18"/>
+              </w:rPr>
+              <w:t xml:space="preserve">Gráficos</w:t>
+            </w:r>
+          </w:p>
+        </w:tc>
+        <w:tc>
+          <w:tcPr>
             <w:tcW w:w="2636" w:type="dxa"/>
             <w:shd w:val="clear" w:color="auto" w:fill="F2F5F9"/>
           </w:tcPr>
@@ -6939,13 +7105,13 @@
                 <w:sz w:val="18"/>
                 <w:szCs w:val="18"/>
               </w:rPr>
-              <w:t xml:space="preserve">Pedidos de venta por día (gráfico)</w:t>
-            </w:r>
-          </w:p>
-        </w:tc>
-        <w:tc>
-          <w:tcPr>
-            <w:tcW w:w="3515" w:type="dxa"/>
+              <w:t xml:space="preserve">Eventos por día (aplicados, repetidos, errores), latencia de cada evento frente al objetivo y pedidos por día</w:t>
+            </w:r>
+          </w:p>
+        </w:tc>
+        <w:tc>
+          <w:tcPr>
+            <w:tcW w:w="2636" w:type="dxa"/>
             <w:shd w:val="clear" w:color="auto" w:fill="F2F5F9"/>
           </w:tcPr>
           <w:p>
@@ -6957,13 +7123,13 @@
                 <w:sz w:val="18"/>
                 <w:szCs w:val="18"/>
               </w:rPr>
-              <w:t xml:space="preserve">Barras por día del periodo elegido (7, 30 o 90 días)</w:t>
-            </w:r>
-          </w:p>
-        </w:tc>
-        <w:tc>
-          <w:tcPr>
-            <w:tcW w:w="2637" w:type="dxa"/>
+              <w:t xml:space="preserve">Ver la tendencia y los picos, no solo la media</w:t>
+            </w:r>
+          </w:p>
+        </w:tc>
+        <w:tc>
+          <w:tcPr>
+            <w:tcW w:w="1231" w:type="dxa"/>
             <w:shd w:val="clear" w:color="auto" w:fill="F2F5F9"/>
           </w:tcPr>
           <w:p>
@@ -6975,7 +7141,7 @@
                 <w:sz w:val="18"/>
                 <w:szCs w:val="18"/>
               </w:rPr>
-              <w:t xml:space="preserve">Ver la evolución del volumen</w:t>
+              <w:t xml:space="preserve">—</w:t>
             </w:r>
           </w:p>
         </w:tc>
@@ -6996,9 +7162,9 @@
       <w:r>
         <w:drawing>
           <wp:inline distT="0" distB="0" distL="0" distR="0">
-            <wp:extent cx="5040000" cy="3225433"/>
+            <wp:extent cx="5040000" cy="2933700"/>
             <wp:effectExtent l="0" t="0" r="0" b="0"/>
-            <wp:docPr id="505" name="Figura 5" descr="Cuadro de mando del back-office ERP/CRM con los datos reales de las pruebas (indicadores, pedidos por día, estados, errores e incidencias)."/>
+            <wp:docPr id="505" name="Figura 5" descr="Cuadro de mando del back-office ERP/CRM con los datos reales de las pruebas: indicadores, eventos de integración por día y latencia de cada evento frente al objetivo de 60 s. La web incluye además la tabla «Por qué medimos estos indicadores»."/>
             <wp:cNvGraphicFramePr>
               <a:graphicFrameLocks noChangeAspect="1"/>
             </wp:cNvGraphicFramePr>
@@ -7018,7 +7184,7 @@
                   <pic:spPr>
                     <a:xfrm>
                       <a:off x="0" y="0"/>
-                      <a:ext cx="5040000" cy="3225433"/>
+                      <a:ext cx="5040000" cy="2933700"/>
                     </a:xfrm>
                     <a:prstGeom prst="rect">
                       <a:avLst/>
@@ -7056,7 +7222,7 @@
           <w:sz w:val="18"/>
           <w:szCs w:val="18"/>
         </w:rPr>
-        <w:t xml:space="preserve">Cuadro de mando del back-office ERP/CRM con los datos reales de las pruebas (indicadores, pedidos por día, estados, errores e incidencias).</w:t>
+        <w:t xml:space="preserve">Cuadro de mando del back-office ERP/CRM con los datos reales de las pruebas: indicadores, eventos de integración por día y latencia de cada evento frente al objetivo de 60 s. La web incluye además la tabla «Por qué medimos estos indicadores».</w:t>
       </w:r>
     </w:p>
     <w:p>

</xml_diff>

<commit_message>
Tarea 2: escenario 1 con Stripe en modo prueba, latencia por mediana y memoria al día
- Payload 1: el pago real del pedido EL-20261030-NAXL con Stripe en modo prueba (tarjeta 4242).
- ERP: la latencia del cuadro de mando es la mediana y cuenta aparte los eventos por encima de 60 s;
  el gráfico usa una escala fija para que los reenvíos manuales no aplasten al resto. Corregido el
  desbordamiento del gráfico de latencia en móvil.
- Memoria: cambios de Nino (apartados 3, 11, 12 y A.3), URL públicas, pago con Stripe y pruebas del 30/10.
- Evidencias: capturas del ERP con los datos de producción del 30/10.
</commit_message>
<xml_diff>
--- a/docs/tarea2/Memoria_Tarea2_Entrelibros.docx
+++ b/docs/tarea2/Memoria_Tarea2_Entrelibros.docx
@@ -692,7 +692,7 @@
                 <w:bCs w:val="1"/>
                 <w:color w:val="383838"/>
               </w:rPr>
-              <w:t xml:space="preserve">1</w:t>
+              <w:t xml:space="preserve">2</w:t>
             </w:r>
             <w:r>
               <w:rPr>
@@ -1228,7 +1228,7 @@
                 <w:bCs w:val="1"/>
                 <w:color w:val="383838"/>
               </w:rPr>
-              <w:t xml:space="preserve">10</w:t>
+              <w:t xml:space="preserve">11</w:t>
             </w:r>
             <w:r>
               <w:rPr>
@@ -1673,7 +1673,7 @@
       </w:r>
       <w:r>
         <w:rPr/>
-        <w:t xml:space="preserve"> Esta tarea se construye sobre la tienda de la Tarea 1, que ya estaba publicada y funcionando: web estática en GitHub Pages, base de datos y lógica en Supabase (PostgreSQL con RLS), proceso de compra completo con pago simulado, back-office y una tabla </w:t>
+        <w:t xml:space="preserve"> Esta tarea se construye sobre la tienda de la Tarea 1, que ya estaba publicada y funcionando: web estática en GitHub Pages, base de datos y lógica en Supabase (PostgreSQL con RLS), proceso de compra completo con pago con Stripe en modo prueba (el sandbox oficial de Stripe: tarjetas de prueba, sin cobro real), back-office y una tabla </w:t>
       </w:r>
       <w:r>
         <w:rPr>
@@ -1692,11 +1692,11 @@
           <w:b w:val="1"/>
           <w:bCs w:val="1"/>
         </w:rPr>
-        <w:t xml:space="preserve">No se ha modificado el proceso de compra</w:t>
-      </w:r>
-      <w:r>
-        <w:rPr/>
-        <w:t xml:space="preserve">: todo lo nuevo se añade alrededor de esos eventos.</w:t>
+        <w:t xml:space="preserve">El proceso de compra no cambia</w:t>
+      </w:r>
+      <w:r>
+        <w:rPr/>
+        <w:t xml:space="preserve"> (solo se han quitado de la página de pago los métodos simulados de la Tarea 1 para dejar Stripe en modo prueba): todo lo nuevo se añade alrededor de esos eventos.</w:t>
       </w:r>
     </w:p>
     <w:p>
@@ -1779,7 +1779,19 @@
       </w:r>
       <w:r>
         <w:rPr/>
-        <w:t xml:space="preserve"> por Telegram antes de que nada llegue al cliente.</w:t>
+        <w:t xml:space="preserve"> por Telegram antes de que nada llegue al cliente. Todo está desplegado y la demostración se hace desde las URL públicas: la tienda y la web del ERP en GitHub Pages, los dos proyectos en Supabase y n8n en Render (</w:t>
+      </w:r>
+      <w:r>
+        <w:rPr>
+          <w:rFonts w:ascii="Courier New" w:hAnsi="Courier New" w:cs="Courier New"/>
+          <w:sz w:val="20"/>
+          <w:szCs w:val="20"/>
+        </w:rPr>
+        <w:t xml:space="preserve">entrelibros-n8n.onrender.com</w:t>
+      </w:r>
+      <w:r>
+        <w:rPr/>
+        <w:t xml:space="preserve">).</w:t>
       </w:r>
     </w:p>
     <w:tbl>
@@ -2227,6 +2239,67 @@
                 <w:sz w:val="18"/>
                 <w:szCs w:val="18"/>
               </w:rPr>
+              <w:t xml:space="preserve">URL pública</w:t>
+            </w:r>
+          </w:p>
+        </w:tc>
+        <w:tc>
+          <w:tcPr>
+            <w:tcW w:w="3691" w:type="dxa"/>
+            <w:shd w:val="clear" w:color="auto" w:fill="FFFFFF"/>
+          </w:tcPr>
+          <w:p>
+            <w:pPr>
+              <w:spacing w:before="0" w:after="0" w:line="240" w:lineRule="auto"/>
+            </w:pPr>
+            <w:r>
+              <w:rPr>
+                <w:rFonts w:ascii="Courier New" w:hAnsi="Courier New" w:cs="Courier New"/>
+                <w:sz w:val="18"/>
+                <w:szCs w:val="18"/>
+              </w:rPr>
+              <w:t xml:space="preserve">pablovip.github.io/entrelibros/</w:t>
+            </w:r>
+          </w:p>
+        </w:tc>
+        <w:tc>
+          <w:tcPr>
+            <w:tcW w:w="3691" w:type="dxa"/>
+            <w:shd w:val="clear" w:color="auto" w:fill="FFFFFF"/>
+          </w:tcPr>
+          <w:p>
+            <w:pPr>
+              <w:spacing w:before="0" w:after="0" w:line="240" w:lineRule="auto"/>
+            </w:pPr>
+            <w:r>
+              <w:rPr>
+                <w:rFonts w:ascii="Courier New" w:hAnsi="Courier New" w:cs="Courier New"/>
+                <w:sz w:val="18"/>
+                <w:szCs w:val="18"/>
+              </w:rPr>
+              <w:t xml:space="preserve">pablovip.github.io/entrelibros/erp/</w:t>
+            </w:r>
+          </w:p>
+        </w:tc>
+      </w:tr>
+      <w:tr>
+        <w:trPr>
+          <w:cantSplit/>
+        </w:trPr>
+        <w:tc>
+          <w:tcPr>
+            <w:tcW w:w="1406" w:type="dxa"/>
+            <w:shd w:val="clear" w:color="auto" w:fill="F2F5F9"/>
+          </w:tcPr>
+          <w:p>
+            <w:pPr>
+              <w:spacing w:before="0" w:after="0" w:line="240" w:lineRule="auto"/>
+            </w:pPr>
+            <w:r>
+              <w:rPr>
+                <w:sz w:val="18"/>
+                <w:szCs w:val="18"/>
+              </w:rPr>
               <w:t xml:space="preserve">Código</w:t>
             </w:r>
           </w:p>
@@ -2234,7 +2307,7 @@
         <w:tc>
           <w:tcPr>
             <w:tcW w:w="3691" w:type="dxa"/>
-            <w:shd w:val="clear" w:color="auto" w:fill="FFFFFF"/>
+            <w:shd w:val="clear" w:color="auto" w:fill="F2F5F9"/>
           </w:tcPr>
           <w:p>
             <w:pPr>
@@ -2268,7 +2341,7 @@
         <w:tc>
           <w:tcPr>
             <w:tcW w:w="3691" w:type="dxa"/>
-            <w:shd w:val="clear" w:color="auto" w:fill="FFFFFF"/>
+            <w:shd w:val="clear" w:color="auto" w:fill="F2F5F9"/>
           </w:tcPr>
           <w:p>
             <w:pPr>
@@ -2296,6 +2369,21 @@
                 <w:szCs w:val="18"/>
               </w:rPr>
               <w:t xml:space="preserve">erp/supabase/01_erp.sql</w:t>
+            </w:r>
+            <w:r>
+              <w:rPr>
+                <w:sz w:val="18"/>
+                <w:szCs w:val="18"/>
+              </w:rPr>
+              <w:t xml:space="preserve"> y </w:t>
+            </w:r>
+            <w:r>
+              <w:rPr>
+                <w:rFonts w:ascii="Courier New" w:hAnsi="Courier New" w:cs="Courier New"/>
+                <w:sz w:val="18"/>
+                <w:szCs w:val="18"/>
+              </w:rPr>
+              <w:t xml:space="preserve">02_orden_eventos.sql</w:t>
             </w:r>
           </w:p>
         </w:tc>
@@ -2817,7 +2905,7 @@
       </w:r>
       <w:r>
         <w:rPr/>
-        <w:t xml:space="preserve"> Por ejemplo, el cliente paga un pedido: se registra </w:t>
+        <w:t xml:space="preserve"> Por ejemplo, el cliente paga un pedido con Stripe: se registra </w:t>
       </w:r>
       <w:r>
         <w:rPr>
@@ -2829,7 +2917,7 @@
       </w:r>
       <w:r>
         <w:rPr/>
-        <w:t xml:space="preserve"> y se encola con su </w:t>
+        <w:t xml:space="preserve"> (el nombre viene de la Tarea 1; el pago es de Stripe en modo prueba) y se encola con su </w:t>
       </w:r>
       <w:r>
         <w:rPr>
@@ -3770,7 +3858,7 @@
                 <w:sz w:val="18"/>
                 <w:szCs w:val="18"/>
               </w:rPr>
-              <w:t xml:space="preserve">) y, en los pedidos, </w:t>
+              <w:t xml:space="preserve">) y </w:t>
             </w:r>
             <w:r>
               <w:rPr>
@@ -3785,7 +3873,7 @@
                 <w:sz w:val="18"/>
                 <w:szCs w:val="18"/>
               </w:rPr>
-              <w:t xml:space="preserve"> (un evento más antiguo que el último aplicado se marca </w:t>
+              <w:t xml:space="preserve"> en pedidos, inventario e incidencias (un evento más antiguo que el último aplicado se marca </w:t>
             </w:r>
             <w:r>
               <w:rPr>
@@ -3800,7 +3888,7 @@
                 <w:sz w:val="18"/>
                 <w:szCs w:val="18"/>
               </w:rPr>
-              <w:t xml:space="preserve">); el stock y las incidencias solo detectan duplicados (ver apartado 11)</w:t>
+              <w:t xml:space="preserve">); la conciliación nocturna del inventario no pisa un ajuste posterior a la foto del stock</w:t>
             </w:r>
           </w:p>
         </w:tc>
@@ -6589,7 +6677,7 @@
                 <w:sz w:val="18"/>
                 <w:szCs w:val="18"/>
               </w:rPr>
-              <w:t xml:space="preserve">Fecha de aplicación − fecha del evento en la tienda</w:t>
+              <w:t xml:space="preserve">Mediana de (fecha de aplicación − fecha del evento en la tienda); se cuentan aparte los que pasan del objetivo</w:t>
             </w:r>
           </w:p>
         </w:tc>
@@ -6607,7 +6695,7 @@
                 <w:sz w:val="18"/>
                 <w:szCs w:val="18"/>
               </w:rPr>
-              <w:t xml:space="preserve">Con retraso, el back-office ve tarde pedidos y stock</w:t>
+              <w:t xml:space="preserve">Con retraso, el back-office ve tarde pedidos y stock; la mediana no se dispara por un reenvío manual o un reintento tardío</w:t>
             </w:r>
           </w:p>
         </w:tc>
@@ -7344,7 +7432,90 @@
       </w:r>
       <w:r>
         <w:rPr/>
-        <w:t xml:space="preserve"> de la tienda al back-office y todos confirmados en la cola de la tienda al primer intento. El único error registrado fue de Gemini (503, «alta demanda»): la rama de error avisó para revisión manual y el análisis se relanzó. En el entorno local se probaron además los rechazos por contrato (422), por clave (403) y los eventos obsoletos.</w:t>
+        <w:t xml:space="preserve"> de la tienda al back-office y todos confirmados en la cola de la tienda al primer intento. El único error registrado fue de Gemini (503, «alta demanda»): la rama de error avisó para revisión manual y el análisis se relanzó. El 30/10 se repitió el escenario 1 </w:t>
+      </w:r>
+      <w:r>
+        <w:rPr>
+          <w:b w:val="1"/>
+          <w:bCs w:val="1"/>
+        </w:rPr>
+        <w:t xml:space="preserve">pagando con Stripe en modo prueba</w:t>
+      </w:r>
+      <w:r>
+        <w:rPr/>
+        <w:t xml:space="preserve"> (tarjeta 4242): el pedido </w:t>
+      </w:r>
+      <w:r>
+        <w:rPr>
+          <w:rFonts w:ascii="Courier New" w:hAnsi="Courier New" w:cs="Courier New"/>
+          <w:sz w:val="20"/>
+          <w:szCs w:val="20"/>
+        </w:rPr>
+        <w:t xml:space="preserve">EL-20261030-NAXL</w:t>
+      </w:r>
+      <w:r>
+        <w:rPr/>
+        <w:t xml:space="preserve"> llega al ERP y pasa de </w:t>
+      </w:r>
+      <w:r>
+        <w:rPr>
+          <w:rFonts w:ascii="Courier New" w:hAnsi="Courier New" w:cs="Courier New"/>
+          <w:sz w:val="20"/>
+          <w:szCs w:val="20"/>
+        </w:rPr>
+        <w:t xml:space="preserve">pendiente_pago</w:t>
+      </w:r>
+      <w:r>
+        <w:rPr/>
+        <w:t xml:space="preserve"> a </w:t>
+      </w:r>
+      <w:r>
+        <w:rPr>
+          <w:rFonts w:ascii="Courier New" w:hAnsi="Courier New" w:cs="Courier New"/>
+          <w:sz w:val="20"/>
+          <w:szCs w:val="20"/>
+        </w:rPr>
+        <w:t xml:space="preserve">pagado</w:t>
+      </w:r>
+      <w:r>
+        <w:rPr/>
+        <w:t xml:space="preserve"> con el método «Tarjeta (Stripe test)», en unos 4 s y confirmado en la cola de la tienda al primer intento. Ese mismo día, con el control de orden ampliado a stock e incidencias, se lanzaron en producción los casos 5, 6 y 7 de </w:t>
+      </w:r>
+      <w:r>
+        <w:rPr>
+          <w:rFonts w:ascii="Courier New" w:hAnsi="Courier New" w:cs="Courier New"/>
+          <w:sz w:val="20"/>
+          <w:szCs w:val="20"/>
+        </w:rPr>
+        <w:t xml:space="preserve">pruebas.md</w:t>
+      </w:r>
+      <w:r>
+        <w:rPr/>
+        <w:t xml:space="preserve">: el ajuste de stock y el cambio de estado antiguos salen </w:t>
+      </w:r>
+      <w:r>
+        <w:rPr>
+          <w:rFonts w:ascii="Courier New" w:hAnsi="Courier New" w:cs="Courier New"/>
+          <w:sz w:val="20"/>
+          <w:szCs w:val="20"/>
+        </w:rPr>
+        <w:t xml:space="preserve">obsoleto</w:t>
+      </w:r>
+      <w:r>
+        <w:rPr/>
+        <w:t xml:space="preserve"> sin tocar el dato, y el evento repetido sale </w:t>
+      </w:r>
+      <w:r>
+        <w:rPr>
+          <w:rFonts w:ascii="Courier New" w:hAnsi="Courier New" w:cs="Courier New"/>
+          <w:sz w:val="20"/>
+          <w:szCs w:val="20"/>
+        </w:rPr>
+        <w:t xml:space="preserve">duplicado</w:t>
+      </w:r>
+      <w:r>
+        <w:rPr/>
+        <w:t xml:space="preserve">; una clave incorrecta se rechazó con 403. Los rechazos por contrato (422) se probaron en el entorno local.</w:t>
       </w:r>
     </w:p>
     <w:p>
@@ -7428,9 +7599,9 @@
       <w:r>
         <w:drawing>
           <wp:inline distT="0" distB="0" distL="0" distR="0">
-            <wp:extent cx="5040000" cy="3246242"/>
+            <wp:extent cx="5040000" cy="4455592"/>
             <wp:effectExtent l="0" t="0" r="0" b="0"/>
-            <wp:docPr id="507" name="Figura 7" descr="Back-office DESPUÉS: el pedido de prueba con su historial (pendiente de pago → pagado → en preparación) e incidencia del CRM con la nota del agente, la propuesta y la revisión humana."/>
+            <wp:docPr id="507" name="Figura 7" descr="Back-office DESPUÉS: el pedido pagado con Stripe en modo prueba (EL-20261030-NAXL) con su historial (pendiente de pago → pagado), los pedidos de las otras pruebas e incidencia del CRM con la nota del agente, la propuesta y la revisión humana."/>
             <wp:cNvGraphicFramePr>
               <a:graphicFrameLocks noChangeAspect="1"/>
             </wp:cNvGraphicFramePr>
@@ -7450,7 +7621,7 @@
                   <pic:spPr>
                     <a:xfrm>
                       <a:off x="0" y="0"/>
-                      <a:ext cx="5040000" cy="3246242"/>
+                      <a:ext cx="5040000" cy="4455592"/>
                     </a:xfrm>
                     <a:prstGeom prst="rect">
                       <a:avLst/>
@@ -7488,7 +7659,7 @@
           <w:sz w:val="18"/>
           <w:szCs w:val="18"/>
         </w:rPr>
-        <w:t xml:space="preserve">Back-office DESPUÉS: el pedido de prueba con su historial (pendiente de pago → pagado → en preparación) e incidencia del CRM con la nota del agente, la propuesta y la revisión humana.</w:t>
+        <w:t xml:space="preserve">Back-office DESPUÉS: el pedido pagado con Stripe en modo prueba (EL-20261030-NAXL) con su historial (pendiente de pago → pagado), los pedidos de las otras pruebas e incidencia del CRM con la nota del agente, la propuesta y la revisión humana.</w:t>
       </w:r>
     </w:p>
     <w:p>
@@ -9386,7 +9557,37 @@
                 <w:sz w:val="18"/>
                 <w:szCs w:val="18"/>
               </w:rPr>
-              <w:t xml:space="preserve">Los duplicados se detectan en todos los eventos, pero solo los pedidos comparan la fecha del último evento aplicado</w:t>
+              <w:t xml:space="preserve">Todos los eventos detectan duplicados y comparan la fecha del último aplicado (</w:t>
+            </w:r>
+            <w:r>
+              <w:rPr>
+                <w:rFonts w:ascii="Courier New" w:hAnsi="Courier New" w:cs="Courier New"/>
+                <w:sz w:val="18"/>
+                <w:szCs w:val="18"/>
+              </w:rPr>
+              <w:t xml:space="preserve">obsoleto</w:t>
+            </w:r>
+            <w:r>
+              <w:rPr>
+                <w:sz w:val="18"/>
+                <w:szCs w:val="18"/>
+              </w:rPr>
+              <w:t xml:space="preserve">); la conciliación nocturna no pisa ajustes posteriores a la foto (</w:t>
+            </w:r>
+            <w:r>
+              <w:rPr>
+                <w:rFonts w:ascii="Courier New" w:hAnsi="Courier New" w:cs="Courier New"/>
+                <w:sz w:val="18"/>
+                <w:szCs w:val="18"/>
+              </w:rPr>
+              <w:t xml:space="preserve">02_orden_eventos.sql</w:t>
+            </w:r>
+            <w:r>
+              <w:rPr>
+                <w:sz w:val="18"/>
+                <w:szCs w:val="18"/>
+              </w:rPr>
+              <w:t xml:space="preserve">)</w:t>
             </w:r>
           </w:p>
         </w:tc>
@@ -9404,52 +9605,7 @@
                 <w:sz w:val="18"/>
                 <w:szCs w:val="18"/>
               </w:rPr>
-              <w:t xml:space="preserve">Guardar </w:t>
-            </w:r>
-            <w:r>
-              <w:rPr>
-                <w:rFonts w:ascii="Courier New" w:hAnsi="Courier New" w:cs="Courier New"/>
-                <w:sz w:val="18"/>
-                <w:szCs w:val="18"/>
-              </w:rPr>
-              <w:t xml:space="preserve">last_event_at</w:t>
-            </w:r>
-            <w:r>
-              <w:rPr>
-                <w:sz w:val="18"/>
-                <w:szCs w:val="18"/>
-              </w:rPr>
-              <w:t xml:space="preserve"> en </w:t>
-            </w:r>
-            <w:r>
-              <w:rPr>
-                <w:rFonts w:ascii="Courier New" w:hAnsi="Courier New" w:cs="Courier New"/>
-                <w:sz w:val="18"/>
-                <w:szCs w:val="18"/>
-              </w:rPr>
-              <w:t xml:space="preserve">inventory</w:t>
-            </w:r>
-            <w:r>
-              <w:rPr>
-                <w:sz w:val="18"/>
-                <w:szCs w:val="18"/>
-              </w:rPr>
-              <w:t xml:space="preserve"> y </w:t>
-            </w:r>
-            <w:r>
-              <w:rPr>
-                <w:rFonts w:ascii="Courier New" w:hAnsi="Courier New" w:cs="Courier New"/>
-                <w:sz w:val="18"/>
-                <w:szCs w:val="18"/>
-              </w:rPr>
-              <w:t xml:space="preserve">tickets</w:t>
-            </w:r>
-            <w:r>
-              <w:rPr>
-                <w:sz w:val="18"/>
-                <w:szCs w:val="18"/>
-              </w:rPr>
-              <w:t xml:space="preserve"> y comparar igual que en los pedidos</w:t>
+              <w:t xml:space="preserve">Alertar si se repiten los obsoletos (señal de reintentos que llegan muy tarde)</w:t>
             </w:r>
           </w:p>
         </w:tc>
@@ -10005,7 +10161,7 @@
                 <w:sz w:val="18"/>
                 <w:szCs w:val="18"/>
               </w:rPr>
-              <w:t xml:space="preserve">Revisión del primer diseño tras la aclaración del profesor y propuesta de sacar el ERP a un proyecto propio; límite detectado: la protección contra eventos fuera de orden (</w:t>
+              <w:t xml:space="preserve">Revisión del primer diseño tras la aclaración del profesor y propuesta de sacar el ERP a un proyecto propio; corrección de los eventos fuera de orden en stock e incidencias (</w:t>
             </w:r>
             <w:r>
               <w:rPr>
@@ -10013,14 +10169,14 @@
                 <w:sz w:val="18"/>
                 <w:szCs w:val="18"/>
               </w:rPr>
-              <w:t xml:space="preserve">last_event_at</w:t>
-            </w:r>
-            <w:r>
-              <w:rPr>
-                <w:sz w:val="18"/>
-                <w:szCs w:val="18"/>
-              </w:rPr>
-              <w:t xml:space="preserve">) solo cubre los pedidos</w:t>
+              <w:t xml:space="preserve">02_orden_eventos.sql</w:t>
+            </w:r>
+            <w:r>
+              <w:rPr>
+                <w:sz w:val="18"/>
+                <w:szCs w:val="18"/>
+              </w:rPr>
+              <w:t xml:space="preserve">)</w:t>
             </w:r>
           </w:p>
         </w:tc>
@@ -10183,7 +10339,7 @@
                 <w:sz w:val="18"/>
                 <w:szCs w:val="18"/>
               </w:rPr>
-              <w:t xml:space="preserve">Pruebas del contrato contra la validación de n8n: evento válido, sin email, importes que no cuadran, formato, duplicado y fuera de orden, con los payloads de error 5 y 6 (</w:t>
+              <w:t xml:space="preserve">Pruebas del contrato: validación de n8n (evento válido, sin email, importes que no cuadran, formato erróneo) y control de duplicados y de orden del back-office, con los payloads de error 5, 6 y 7 (</w:t>
             </w:r>
             <w:r>
               <w:rPr>
@@ -10198,7 +10354,7 @@
                 <w:sz w:val="18"/>
                 <w:szCs w:val="18"/>
               </w:rPr>
-              <w:t xml:space="preserve">)</w:t>
+              <w:t xml:space="preserve">); fechas del evento en los workflows 1 y 4</w:t>
             </w:r>
           </w:p>
         </w:tc>
@@ -11683,7 +11839,19 @@
       </w:r>
       <w:r>
         <w:rPr/>
-        <w:t xml:space="preserve">) y los payloads de error 5 (número de pedido mal formado) y 6 (evento fuera de orden), y preparar el borrador de mi parte de esta memoria.</w:t>
+        <w:t xml:space="preserve">) y los payloads de error 5 (número de pedido mal formado) y 6 (evento fuera de orden); corregir los eventos fuera de orden en stock e incidencias (</w:t>
+      </w:r>
+      <w:r>
+        <w:rPr>
+          <w:rFonts w:ascii="Courier New" w:hAnsi="Courier New" w:cs="Courier New"/>
+          <w:sz w:val="20"/>
+          <w:szCs w:val="20"/>
+        </w:rPr>
+        <w:t xml:space="preserve">02_orden_eventos.sql</w:t>
+      </w:r>
+      <w:r>
+        <w:rPr/>
+        <w:t xml:space="preserve"> y workflows 1 y 4), y preparar el borrador de mi parte de esta memoria.</w:t>
       </w:r>
     </w:p>
     <w:p>
@@ -11761,13 +11929,13 @@
       </w:r>
       <w:r>
         <w:rPr/>
-        <w:t xml:space="preserve">) sobre todos los textos de la página: ninguno queda sin traducir, no hay claves duplicadas y no cambia ninguna traducción que ya existía. </w:t>
+        <w:t xml:space="preserve">) sobre todos los textos de la página: ninguno queda sin traducir, no hay claves duplicadas y no cambia ninguna traducción que ya existía; y el 02, con 35 pruebas automáticas en un PostgreSQL desechable en memoria (PGlite), sin tocar Supabase. Los casos 5, 6 y 7 se repitieron en el n8n desplegado el 30/10 con el resultado esperado. </w:t>
       </w:r>
       <w:r>
         <w:rPr>
           <w:highlight w:val="yellow"/>
         </w:rPr>
-        <w:t xml:space="preserve">Pendiente: probar la página en inglés con el usuario administrador y repetir los casos 5 y 6 en el n8n desplegado.</w:t>
+        <w:t xml:space="preserve">Pendiente: probar la página en inglés con el usuario administrador.</w:t>
       </w:r>
     </w:p>
     <w:p>
@@ -12205,7 +12373,7 @@
                 <w:sz w:val="18"/>
                 <w:szCs w:val="18"/>
               </w:rPr>
-              <w:t xml:space="preserve">Propuesta: la misma comparación en las tablas </w:t>
+              <w:t xml:space="preserve">Corregido en </w:t>
             </w:r>
             <w:r>
               <w:rPr>
@@ -12213,14 +12381,14 @@
                 <w:sz w:val="18"/>
                 <w:szCs w:val="18"/>
               </w:rPr>
-              <w:t xml:space="preserve">inventory</w:t>
-            </w:r>
-            <w:r>
-              <w:rPr>
-                <w:sz w:val="18"/>
-                <w:szCs w:val="18"/>
-              </w:rPr>
-              <w:t xml:space="preserve"> y </w:t>
+              <w:t xml:space="preserve">erp/supabase/02_orden_eventos.sql</w:t>
+            </w:r>
+            <w:r>
+              <w:rPr>
+                <w:sz w:val="18"/>
+                <w:szCs w:val="18"/>
+              </w:rPr>
+              <w:t xml:space="preserve"> y en los workflows 1 y 4 (caso 7 de </w:t>
             </w:r>
             <w:r>
               <w:rPr>
@@ -12228,14 +12396,73 @@
                 <w:sz w:val="18"/>
                 <w:szCs w:val="18"/>
               </w:rPr>
-              <w:t xml:space="preserve">tickets</w:t>
-            </w:r>
-            <w:r>
-              <w:rPr>
-                <w:sz w:val="18"/>
-                <w:szCs w:val="18"/>
-              </w:rPr>
-              <w:t xml:space="preserve"> del ERP</w:t>
+              <w:t xml:space="preserve">pruebas.md</w:t>
+            </w:r>
+            <w:r>
+              <w:rPr>
+                <w:sz w:val="18"/>
+                <w:szCs w:val="18"/>
+              </w:rPr>
+              <w:t xml:space="preserve">)</w:t>
+            </w:r>
+          </w:p>
+        </w:tc>
+      </w:tr>
+      <w:tr>
+        <w:trPr>
+          <w:cantSplit/>
+        </w:trPr>
+        <w:tc>
+          <w:tcPr>
+            <w:tcW w:w="2636" w:type="dxa"/>
+            <w:shd w:val="clear" w:color="auto" w:fill="F2F5F9"/>
+          </w:tcPr>
+          <w:p>
+            <w:pPr>
+              <w:spacing w:before="0" w:after="0" w:line="240" w:lineRule="auto"/>
+            </w:pPr>
+            <w:r>
+              <w:rPr>
+                <w:sz w:val="18"/>
+                <w:szCs w:val="18"/>
+              </w:rPr>
+              <w:t xml:space="preserve">Versiones antiguas de las funciones</w:t>
+            </w:r>
+          </w:p>
+        </w:tc>
+        <w:tc>
+          <w:tcPr>
+            <w:tcW w:w="3076" w:type="dxa"/>
+            <w:shd w:val="clear" w:color="auto" w:fill="F2F5F9"/>
+          </w:tcPr>
+          <w:p>
+            <w:pPr>
+              <w:spacing w:before="0" w:after="0" w:line="240" w:lineRule="auto"/>
+            </w:pPr>
+            <w:r>
+              <w:rPr>
+                <w:sz w:val="18"/>
+                <w:szCs w:val="18"/>
+              </w:rPr>
+              <w:t xml:space="preserve">Al añadir un parámetro, PostgreSQL deja también la función antigua y la API no sabría cuál usar</w:t>
+            </w:r>
+          </w:p>
+        </w:tc>
+        <w:tc>
+          <w:tcPr>
+            <w:tcW w:w="3076" w:type="dxa"/>
+            <w:shd w:val="clear" w:color="auto" w:fill="F2F5F9"/>
+          </w:tcPr>
+          <w:p>
+            <w:pPr>
+              <w:spacing w:before="0" w:after="0" w:line="240" w:lineRule="auto"/>
+            </w:pPr>
+            <w:r>
+              <w:rPr>
+                <w:sz w:val="18"/>
+                <w:szCs w:val="18"/>
+              </w:rPr>
+              <w:t xml:space="preserve">El 02 borra las antiguas; se avisa de que va siempre después del 01</w:t>
             </w:r>
           </w:p>
         </w:tc>

</xml_diff>